<commit_message>
Agrega documentacion UML, MER y BDD a TI.1.2 y TI.1.3 y ajusta ERS/ECUD al servidor
- Copia y adapta ERS, ECUD y diagramas para SOAP .NET y REST Java
- Crea los workspaces de PowerDesigner de TI.1.2 y TI.1.3
- Ajusta los diagramas de actividad a cada tecnologia
- Corrige los autores de las fichas del ECUD
- Alinea unidades, catalogo y operaciones de los documentos con lo implementado
</commit_message>
<xml_diff>
--- a/TI.1.1 PAO202651_SOAP_JAVA_SINBDD_NRC36883_GR09/01. UML/0.1 ERS/ERS_CONVERSION_UNIDADES_SEGURIDAD_COMPLETA (1).docx
+++ b/TI.1.1 PAO202651_SOAP_JAVA_SINBDD_NRC36883_GR09/01. UML/0.1 ERS/ERS_CONVERSION_UNIDADES_SEGURIDAD_COMPLETA (1).docx
@@ -4,13 +4,9 @@
   <w:body>
     <w:p>
       <w:pPr>
+        <w:ind w:left="720" w:hanging="720"/>
         <w:sectPr>
-          <w:headerReference w:type="even" r:id="rId7"/>
-          <w:headerReference w:type="default" r:id="rId8"/>
-          <w:footerReference w:type="even" r:id="rId9"/>
-          <w:footerReference w:type="default" r:id="rId10"/>
-          <w:headerReference w:type="first" r:id="rId11"/>
-          <w:footerReference w:type="first" r:id="rId12"/>
+          <w:footerReference w:type="default" r:id="rId7"/>
           <w:pgSz w:w="11906" w:h="16838"/>
           <w:pgMar w:top="1418" w:right="1701" w:bottom="1418" w:left="1701" w:header="709" w:footer="709" w:gutter="0"/>
           <w:pgBorders w:offsetFrom="page">
@@ -2927,7 +2923,7 @@
                     <pic:cNvPicPr preferRelativeResize="0"/>
                   </pic:nvPicPr>
                   <pic:blipFill>
-                    <a:blip r:embed="rId13"/>
+                    <a:blip r:embed="rId8"/>
                     <a:srcRect/>
                     <a:stretch>
                       <a:fillRect/>
@@ -3010,7 +3006,7 @@
       <w:r>
         <w:fldChar w:fldCharType="separate"/>
       </w:r>
-      <w:hyperlink w:anchor="_Toc243263136" w:history="1">
+      <w:hyperlink w:anchor="_Toc243458878" w:history="1">
         <w:r>
           <w:rPr>
             <w:rStyle w:val="Hipervnculo"/>
@@ -3037,7 +3033,7 @@
             <w:noProof/>
             <w:webHidden/>
           </w:rPr>
-          <w:instrText xml:space="preserve"> PAGEREF _Toc243263136 \h </w:instrText>
+          <w:instrText xml:space="preserve"> PAGEREF _Toc243458878 \h </w:instrText>
         </w:r>
         <w:r>
           <w:rPr>
@@ -3085,7 +3081,7 @@
           <w14:ligatures w14:val="standardContextual"/>
         </w:rPr>
       </w:pPr>
-      <w:hyperlink w:anchor="_Toc243263137" w:history="1">
+      <w:hyperlink w:anchor="_Toc243458879" w:history="1">
         <w:r>
           <w:rPr>
             <w:rStyle w:val="Hipervnculo"/>
@@ -3112,7 +3108,7 @@
             <w:noProof/>
             <w:webHidden/>
           </w:rPr>
-          <w:instrText xml:space="preserve"> PAGEREF _Toc243263137 \h </w:instrText>
+          <w:instrText xml:space="preserve"> PAGEREF _Toc243458879 \h </w:instrText>
         </w:r>
         <w:r>
           <w:rPr>
@@ -3160,7 +3156,7 @@
           <w14:ligatures w14:val="standardContextual"/>
         </w:rPr>
       </w:pPr>
-      <w:hyperlink w:anchor="_Toc243263138" w:history="1">
+      <w:hyperlink w:anchor="_Toc243458880" w:history="1">
         <w:r>
           <w:rPr>
             <w:rStyle w:val="Hipervnculo"/>
@@ -3187,7 +3183,7 @@
             <w:noProof/>
             <w:webHidden/>
           </w:rPr>
-          <w:instrText xml:space="preserve"> PAGEREF _Toc243263138 \h </w:instrText>
+          <w:instrText xml:space="preserve"> PAGEREF _Toc243458880 \h </w:instrText>
         </w:r>
         <w:r>
           <w:rPr>
@@ -3235,7 +3231,7 @@
           <w14:ligatures w14:val="standardContextual"/>
         </w:rPr>
       </w:pPr>
-      <w:hyperlink w:anchor="_Toc243263139" w:history="1">
+      <w:hyperlink w:anchor="_Toc243458881" w:history="1">
         <w:r>
           <w:rPr>
             <w:rStyle w:val="Hipervnculo"/>
@@ -3262,7 +3258,7 @@
             <w:noProof/>
             <w:webHidden/>
           </w:rPr>
-          <w:instrText xml:space="preserve"> PAGEREF _Toc243263139 \h </w:instrText>
+          <w:instrText xml:space="preserve"> PAGEREF _Toc243458881 \h </w:instrText>
         </w:r>
         <w:r>
           <w:rPr>
@@ -3310,7 +3306,7 @@
           <w14:ligatures w14:val="standardContextual"/>
         </w:rPr>
       </w:pPr>
-      <w:hyperlink w:anchor="_Toc243263140" w:history="1">
+      <w:hyperlink w:anchor="_Toc243458882" w:history="1">
         <w:r>
           <w:rPr>
             <w:rStyle w:val="Hipervnculo"/>
@@ -3337,7 +3333,7 @@
             <w:noProof/>
             <w:webHidden/>
           </w:rPr>
-          <w:instrText xml:space="preserve"> PAGEREF _Toc243263140 \h </w:instrText>
+          <w:instrText xml:space="preserve"> PAGEREF _Toc243458882 \h </w:instrText>
         </w:r>
         <w:r>
           <w:rPr>
@@ -3385,7 +3381,7 @@
           <w14:ligatures w14:val="standardContextual"/>
         </w:rPr>
       </w:pPr>
-      <w:hyperlink w:anchor="_Toc243263141" w:history="1">
+      <w:hyperlink w:anchor="_Toc243458883" w:history="1">
         <w:r>
           <w:rPr>
             <w:rStyle w:val="Hipervnculo"/>
@@ -3412,7 +3408,7 @@
             <w:noProof/>
             <w:webHidden/>
           </w:rPr>
-          <w:instrText xml:space="preserve"> PAGEREF _Toc243263141 \h </w:instrText>
+          <w:instrText xml:space="preserve"> PAGEREF _Toc243458883 \h </w:instrText>
         </w:r>
         <w:r>
           <w:rPr>
@@ -3460,7 +3456,7 @@
           <w14:ligatures w14:val="standardContextual"/>
         </w:rPr>
       </w:pPr>
-      <w:hyperlink w:anchor="_Toc243263142" w:history="1">
+      <w:hyperlink w:anchor="_Toc243458884" w:history="1">
         <w:r>
           <w:rPr>
             <w:rStyle w:val="Hipervnculo"/>
@@ -3487,7 +3483,7 @@
             <w:noProof/>
             <w:webHidden/>
           </w:rPr>
-          <w:instrText xml:space="preserve"> PAGEREF _Toc243263142 \h </w:instrText>
+          <w:instrText xml:space="preserve"> PAGEREF _Toc243458884 \h </w:instrText>
         </w:r>
         <w:r>
           <w:rPr>
@@ -3535,7 +3531,7 @@
           <w14:ligatures w14:val="standardContextual"/>
         </w:rPr>
       </w:pPr>
-      <w:hyperlink w:anchor="_Toc243263143" w:history="1">
+      <w:hyperlink w:anchor="_Toc243458885" w:history="1">
         <w:r>
           <w:rPr>
             <w:rStyle w:val="Hipervnculo"/>
@@ -3562,7 +3558,7 @@
             <w:noProof/>
             <w:webHidden/>
           </w:rPr>
-          <w:instrText xml:space="preserve"> PAGEREF _Toc243263143 \h </w:instrText>
+          <w:instrText xml:space="preserve"> PAGEREF _Toc243458885 \h </w:instrText>
         </w:r>
         <w:r>
           <w:rPr>
@@ -3610,7 +3606,7 @@
           <w14:ligatures w14:val="standardContextual"/>
         </w:rPr>
       </w:pPr>
-      <w:hyperlink w:anchor="_Toc243263144" w:history="1">
+      <w:hyperlink w:anchor="_Toc243458886" w:history="1">
         <w:r>
           <w:rPr>
             <w:rStyle w:val="Hipervnculo"/>
@@ -3637,7 +3633,7 @@
             <w:noProof/>
             <w:webHidden/>
           </w:rPr>
-          <w:instrText xml:space="preserve"> PAGEREF _Toc243263144 \h </w:instrText>
+          <w:instrText xml:space="preserve"> PAGEREF _Toc243458886 \h </w:instrText>
         </w:r>
         <w:r>
           <w:rPr>
@@ -3685,7 +3681,7 @@
           <w14:ligatures w14:val="standardContextual"/>
         </w:rPr>
       </w:pPr>
-      <w:hyperlink w:anchor="_Toc243263145" w:history="1">
+      <w:hyperlink w:anchor="_Toc243458887" w:history="1">
         <w:r>
           <w:rPr>
             <w:rStyle w:val="Hipervnculo"/>
@@ -3712,7 +3708,7 @@
             <w:noProof/>
             <w:webHidden/>
           </w:rPr>
-          <w:instrText xml:space="preserve"> PAGEREF _Toc243263145 \h </w:instrText>
+          <w:instrText xml:space="preserve"> PAGEREF _Toc243458887 \h </w:instrText>
         </w:r>
         <w:r>
           <w:rPr>
@@ -3760,7 +3756,7 @@
           <w14:ligatures w14:val="standardContextual"/>
         </w:rPr>
       </w:pPr>
-      <w:hyperlink w:anchor="_Toc243263146" w:history="1">
+      <w:hyperlink w:anchor="_Toc243458888" w:history="1">
         <w:r>
           <w:rPr>
             <w:rStyle w:val="Hipervnculo"/>
@@ -3787,7 +3783,7 @@
             <w:noProof/>
             <w:webHidden/>
           </w:rPr>
-          <w:instrText xml:space="preserve"> PAGEREF _Toc243263146 \h </w:instrText>
+          <w:instrText xml:space="preserve"> PAGEREF _Toc243458888 \h </w:instrText>
         </w:r>
         <w:r>
           <w:rPr>
@@ -3835,7 +3831,7 @@
           <w14:ligatures w14:val="standardContextual"/>
         </w:rPr>
       </w:pPr>
-      <w:hyperlink w:anchor="_Toc243263147" w:history="1">
+      <w:hyperlink w:anchor="_Toc243458889" w:history="1">
         <w:r>
           <w:rPr>
             <w:rStyle w:val="Hipervnculo"/>
@@ -3862,7 +3858,7 @@
             <w:noProof/>
             <w:webHidden/>
           </w:rPr>
-          <w:instrText xml:space="preserve"> PAGEREF _Toc243263147 \h </w:instrText>
+          <w:instrText xml:space="preserve"> PAGEREF _Toc243458889 \h </w:instrText>
         </w:r>
         <w:r>
           <w:rPr>
@@ -3910,7 +3906,7 @@
           <w14:ligatures w14:val="standardContextual"/>
         </w:rPr>
       </w:pPr>
-      <w:hyperlink w:anchor="_Toc243263148" w:history="1">
+      <w:hyperlink w:anchor="_Toc243458890" w:history="1">
         <w:r>
           <w:rPr>
             <w:rStyle w:val="Hipervnculo"/>
@@ -3937,7 +3933,7 @@
             <w:noProof/>
             <w:webHidden/>
           </w:rPr>
-          <w:instrText xml:space="preserve"> PAGEREF _Toc243263148 \h </w:instrText>
+          <w:instrText xml:space="preserve"> PAGEREF _Toc243458890 \h </w:instrText>
         </w:r>
         <w:r>
           <w:rPr>
@@ -3985,7 +3981,7 @@
           <w14:ligatures w14:val="standardContextual"/>
         </w:rPr>
       </w:pPr>
-      <w:hyperlink w:anchor="_Toc243263149" w:history="1">
+      <w:hyperlink w:anchor="_Toc243458891" w:history="1">
         <w:r>
           <w:rPr>
             <w:rStyle w:val="Hipervnculo"/>
@@ -4012,7 +4008,7 @@
             <w:noProof/>
             <w:webHidden/>
           </w:rPr>
-          <w:instrText xml:space="preserve"> PAGEREF _Toc243263149 \h </w:instrText>
+          <w:instrText xml:space="preserve"> PAGEREF _Toc243458891 \h </w:instrText>
         </w:r>
         <w:r>
           <w:rPr>
@@ -4060,7 +4056,7 @@
           <w14:ligatures w14:val="standardContextual"/>
         </w:rPr>
       </w:pPr>
-      <w:hyperlink w:anchor="_Toc243263150" w:history="1">
+      <w:hyperlink w:anchor="_Toc243458892" w:history="1">
         <w:r>
           <w:rPr>
             <w:rStyle w:val="Hipervnculo"/>
@@ -4087,7 +4083,7 @@
             <w:noProof/>
             <w:webHidden/>
           </w:rPr>
-          <w:instrText xml:space="preserve"> PAGEREF _Toc243263150 \h </w:instrText>
+          <w:instrText xml:space="preserve"> PAGEREF _Toc243458892 \h </w:instrText>
         </w:r>
         <w:r>
           <w:rPr>
@@ -4135,7 +4131,7 @@
           <w14:ligatures w14:val="standardContextual"/>
         </w:rPr>
       </w:pPr>
-      <w:hyperlink w:anchor="_Toc243263151" w:history="1">
+      <w:hyperlink w:anchor="_Toc243458893" w:history="1">
         <w:r>
           <w:rPr>
             <w:rStyle w:val="Hipervnculo"/>
@@ -4162,7 +4158,7 @@
             <w:noProof/>
             <w:webHidden/>
           </w:rPr>
-          <w:instrText xml:space="preserve"> PAGEREF _Toc243263151 \h </w:instrText>
+          <w:instrText xml:space="preserve"> PAGEREF _Toc243458893 \h </w:instrText>
         </w:r>
         <w:r>
           <w:rPr>
@@ -4210,7 +4206,7 @@
           <w14:ligatures w14:val="standardContextual"/>
         </w:rPr>
       </w:pPr>
-      <w:hyperlink w:anchor="_Toc243263152" w:history="1">
+      <w:hyperlink w:anchor="_Toc243458894" w:history="1">
         <w:r>
           <w:rPr>
             <w:rStyle w:val="Hipervnculo"/>
@@ -4237,7 +4233,7 @@
             <w:noProof/>
             <w:webHidden/>
           </w:rPr>
-          <w:instrText xml:space="preserve"> PAGEREF _Toc243263152 \h </w:instrText>
+          <w:instrText xml:space="preserve"> PAGEREF _Toc243458894 \h </w:instrText>
         </w:r>
         <w:r>
           <w:rPr>
@@ -4285,7 +4281,7 @@
           <w14:ligatures w14:val="standardContextual"/>
         </w:rPr>
       </w:pPr>
-      <w:hyperlink w:anchor="_Toc243263153" w:history="1">
+      <w:hyperlink w:anchor="_Toc243458895" w:history="1">
         <w:r>
           <w:rPr>
             <w:rStyle w:val="Hipervnculo"/>
@@ -4312,7 +4308,7 @@
             <w:noProof/>
             <w:webHidden/>
           </w:rPr>
-          <w:instrText xml:space="preserve"> PAGEREF _Toc243263153 \h </w:instrText>
+          <w:instrText xml:space="preserve"> PAGEREF _Toc243458895 \h </w:instrText>
         </w:r>
         <w:r>
           <w:rPr>
@@ -4360,7 +4356,7 @@
           <w14:ligatures w14:val="standardContextual"/>
         </w:rPr>
       </w:pPr>
-      <w:hyperlink w:anchor="_Toc243263154" w:history="1">
+      <w:hyperlink w:anchor="_Toc243458896" w:history="1">
         <w:r>
           <w:rPr>
             <w:rStyle w:val="Hipervnculo"/>
@@ -4387,7 +4383,7 @@
             <w:noProof/>
             <w:webHidden/>
           </w:rPr>
-          <w:instrText xml:space="preserve"> PAGEREF _Toc243263154 \h </w:instrText>
+          <w:instrText xml:space="preserve"> PAGEREF _Toc243458896 \h </w:instrText>
         </w:r>
         <w:r>
           <w:rPr>
@@ -4435,7 +4431,7 @@
           <w14:ligatures w14:val="standardContextual"/>
         </w:rPr>
       </w:pPr>
-      <w:hyperlink w:anchor="_Toc243263155" w:history="1">
+      <w:hyperlink w:anchor="_Toc243458897" w:history="1">
         <w:r>
           <w:rPr>
             <w:rStyle w:val="Hipervnculo"/>
@@ -4462,7 +4458,7 @@
             <w:noProof/>
             <w:webHidden/>
           </w:rPr>
-          <w:instrText xml:space="preserve"> PAGEREF _Toc243263155 \h </w:instrText>
+          <w:instrText xml:space="preserve"> PAGEREF _Toc243458897 \h </w:instrText>
         </w:r>
         <w:r>
           <w:rPr>
@@ -4510,7 +4506,7 @@
           <w14:ligatures w14:val="standardContextual"/>
         </w:rPr>
       </w:pPr>
-      <w:hyperlink w:anchor="_Toc243263156" w:history="1">
+      <w:hyperlink w:anchor="_Toc243458898" w:history="1">
         <w:r>
           <w:rPr>
             <w:rStyle w:val="Hipervnculo"/>
@@ -4537,7 +4533,7 @@
             <w:noProof/>
             <w:webHidden/>
           </w:rPr>
-          <w:instrText xml:space="preserve"> PAGEREF _Toc243263156 \h </w:instrText>
+          <w:instrText xml:space="preserve"> PAGEREF _Toc243458898 \h </w:instrText>
         </w:r>
         <w:r>
           <w:rPr>
@@ -4585,7 +4581,7 @@
           <w14:ligatures w14:val="standardContextual"/>
         </w:rPr>
       </w:pPr>
-      <w:hyperlink w:anchor="_Toc243263157" w:history="1">
+      <w:hyperlink w:anchor="_Toc243458899" w:history="1">
         <w:r>
           <w:rPr>
             <w:rStyle w:val="Hipervnculo"/>
@@ -4612,7 +4608,7 @@
             <w:noProof/>
             <w:webHidden/>
           </w:rPr>
-          <w:instrText xml:space="preserve"> PAGEREF _Toc243263157 \h </w:instrText>
+          <w:instrText xml:space="preserve"> PAGEREF _Toc243458899 \h </w:instrText>
         </w:r>
         <w:r>
           <w:rPr>
@@ -4660,7 +4656,7 @@
           <w14:ligatures w14:val="standardContextual"/>
         </w:rPr>
       </w:pPr>
-      <w:hyperlink w:anchor="_Toc243263158" w:history="1">
+      <w:hyperlink w:anchor="_Toc243458900" w:history="1">
         <w:r>
           <w:rPr>
             <w:rStyle w:val="Hipervnculo"/>
@@ -4687,7 +4683,7 @@
             <w:noProof/>
             <w:webHidden/>
           </w:rPr>
-          <w:instrText xml:space="preserve"> PAGEREF _Toc243263158 \h </w:instrText>
+          <w:instrText xml:space="preserve"> PAGEREF _Toc243458900 \h </w:instrText>
         </w:r>
         <w:r>
           <w:rPr>
@@ -4735,7 +4731,7 @@
           <w14:ligatures w14:val="standardContextual"/>
         </w:rPr>
       </w:pPr>
-      <w:hyperlink w:anchor="_Toc243263159" w:history="1">
+      <w:hyperlink w:anchor="_Toc243458901" w:history="1">
         <w:r>
           <w:rPr>
             <w:rStyle w:val="Hipervnculo"/>
@@ -4762,7 +4758,7 @@
             <w:noProof/>
             <w:webHidden/>
           </w:rPr>
-          <w:instrText xml:space="preserve"> PAGEREF _Toc243263159 \h </w:instrText>
+          <w:instrText xml:space="preserve"> PAGEREF _Toc243458901 \h </w:instrText>
         </w:r>
         <w:r>
           <w:rPr>
@@ -4810,7 +4806,7 @@
           <w14:ligatures w14:val="standardContextual"/>
         </w:rPr>
       </w:pPr>
-      <w:hyperlink w:anchor="_Toc243263160" w:history="1">
+      <w:hyperlink w:anchor="_Toc243458902" w:history="1">
         <w:r>
           <w:rPr>
             <w:rStyle w:val="Hipervnculo"/>
@@ -4837,7 +4833,7 @@
             <w:noProof/>
             <w:webHidden/>
           </w:rPr>
-          <w:instrText xml:space="preserve"> PAGEREF _Toc243263160 \h </w:instrText>
+          <w:instrText xml:space="preserve"> PAGEREF _Toc243458902 \h </w:instrText>
         </w:r>
         <w:r>
           <w:rPr>
@@ -4885,7 +4881,7 @@
           <w14:ligatures w14:val="standardContextual"/>
         </w:rPr>
       </w:pPr>
-      <w:hyperlink w:anchor="_Toc243263161" w:history="1">
+      <w:hyperlink w:anchor="_Toc243458903" w:history="1">
         <w:r>
           <w:rPr>
             <w:rStyle w:val="Hipervnculo"/>
@@ -4912,7 +4908,7 @@
             <w:noProof/>
             <w:webHidden/>
           </w:rPr>
-          <w:instrText xml:space="preserve"> PAGEREF _Toc243263161 \h </w:instrText>
+          <w:instrText xml:space="preserve"> PAGEREF _Toc243458903 \h </w:instrText>
         </w:r>
         <w:r>
           <w:rPr>
@@ -4960,7 +4956,7 @@
           <w14:ligatures w14:val="standardContextual"/>
         </w:rPr>
       </w:pPr>
-      <w:hyperlink w:anchor="_Toc243263162" w:history="1">
+      <w:hyperlink w:anchor="_Toc243458904" w:history="1">
         <w:r>
           <w:rPr>
             <w:rStyle w:val="Hipervnculo"/>
@@ -4987,7 +4983,7 @@
             <w:noProof/>
             <w:webHidden/>
           </w:rPr>
-          <w:instrText xml:space="preserve"> PAGEREF _Toc243263162 \h </w:instrText>
+          <w:instrText xml:space="preserve"> PAGEREF _Toc243458904 \h </w:instrText>
         </w:r>
         <w:r>
           <w:rPr>
@@ -5035,7 +5031,7 @@
           <w14:ligatures w14:val="standardContextual"/>
         </w:rPr>
       </w:pPr>
-      <w:hyperlink w:anchor="_Toc243263163" w:history="1">
+      <w:hyperlink w:anchor="_Toc243458905" w:history="1">
         <w:r>
           <w:rPr>
             <w:rStyle w:val="Hipervnculo"/>
@@ -5062,7 +5058,7 @@
             <w:noProof/>
             <w:webHidden/>
           </w:rPr>
-          <w:instrText xml:space="preserve"> PAGEREF _Toc243263163 \h </w:instrText>
+          <w:instrText xml:space="preserve"> PAGEREF _Toc243458905 \h </w:instrText>
         </w:r>
         <w:r>
           <w:rPr>
@@ -5110,7 +5106,7 @@
           <w14:ligatures w14:val="standardContextual"/>
         </w:rPr>
       </w:pPr>
-      <w:hyperlink w:anchor="_Toc243263164" w:history="1">
+      <w:hyperlink w:anchor="_Toc243458906" w:history="1">
         <w:r>
           <w:rPr>
             <w:rStyle w:val="Hipervnculo"/>
@@ -5137,7 +5133,7 @@
             <w:noProof/>
             <w:webHidden/>
           </w:rPr>
-          <w:instrText xml:space="preserve"> PAGEREF _Toc243263164 \h </w:instrText>
+          <w:instrText xml:space="preserve"> PAGEREF _Toc243458906 \h </w:instrText>
         </w:r>
         <w:r>
           <w:rPr>
@@ -5185,7 +5181,7 @@
           <w14:ligatures w14:val="standardContextual"/>
         </w:rPr>
       </w:pPr>
-      <w:hyperlink w:anchor="_Toc243263165" w:history="1">
+      <w:hyperlink w:anchor="_Toc243458907" w:history="1">
         <w:r>
           <w:rPr>
             <w:rStyle w:val="Hipervnculo"/>
@@ -5212,7 +5208,7 @@
             <w:noProof/>
             <w:webHidden/>
           </w:rPr>
-          <w:instrText xml:space="preserve"> PAGEREF _Toc243263165 \h </w:instrText>
+          <w:instrText xml:space="preserve"> PAGEREF _Toc243458907 \h </w:instrText>
         </w:r>
         <w:r>
           <w:rPr>
@@ -5260,7 +5256,7 @@
           <w14:ligatures w14:val="standardContextual"/>
         </w:rPr>
       </w:pPr>
-      <w:hyperlink w:anchor="_Toc243263166" w:history="1">
+      <w:hyperlink w:anchor="_Toc243458908" w:history="1">
         <w:r>
           <w:rPr>
             <w:rStyle w:val="Hipervnculo"/>
@@ -5287,7 +5283,7 @@
             <w:noProof/>
             <w:webHidden/>
           </w:rPr>
-          <w:instrText xml:space="preserve"> PAGEREF _Toc243263166 \h </w:instrText>
+          <w:instrText xml:space="preserve"> PAGEREF _Toc243458908 \h </w:instrText>
         </w:r>
         <w:r>
           <w:rPr>
@@ -5335,7 +5331,7 @@
           <w14:ligatures w14:val="standardContextual"/>
         </w:rPr>
       </w:pPr>
-      <w:hyperlink w:anchor="_Toc243263167" w:history="1">
+      <w:hyperlink w:anchor="_Toc243458909" w:history="1">
         <w:r>
           <w:rPr>
             <w:rStyle w:val="Hipervnculo"/>
@@ -5362,7 +5358,7 @@
             <w:noProof/>
             <w:webHidden/>
           </w:rPr>
-          <w:instrText xml:space="preserve"> PAGEREF _Toc243263167 \h </w:instrText>
+          <w:instrText xml:space="preserve"> PAGEREF _Toc243458909 \h </w:instrText>
         </w:r>
         <w:r>
           <w:rPr>
@@ -5410,7 +5406,7 @@
           <w14:ligatures w14:val="standardContextual"/>
         </w:rPr>
       </w:pPr>
-      <w:hyperlink w:anchor="_Toc243263168" w:history="1">
+      <w:hyperlink w:anchor="_Toc243458910" w:history="1">
         <w:r>
           <w:rPr>
             <w:rStyle w:val="Hipervnculo"/>
@@ -5437,7 +5433,7 @@
             <w:noProof/>
             <w:webHidden/>
           </w:rPr>
-          <w:instrText xml:space="preserve"> PAGEREF _Toc243263168 \h </w:instrText>
+          <w:instrText xml:space="preserve"> PAGEREF _Toc243458910 \h </w:instrText>
         </w:r>
         <w:r>
           <w:rPr>
@@ -5485,7 +5481,7 @@
           <w14:ligatures w14:val="standardContextual"/>
         </w:rPr>
       </w:pPr>
-      <w:hyperlink w:anchor="_Toc243263169" w:history="1">
+      <w:hyperlink w:anchor="_Toc243458911" w:history="1">
         <w:r>
           <w:rPr>
             <w:rStyle w:val="Hipervnculo"/>
@@ -5512,7 +5508,7 @@
             <w:noProof/>
             <w:webHidden/>
           </w:rPr>
-          <w:instrText xml:space="preserve"> PAGEREF _Toc243263169 \h </w:instrText>
+          <w:instrText xml:space="preserve"> PAGEREF _Toc243458911 \h </w:instrText>
         </w:r>
         <w:r>
           <w:rPr>
@@ -5560,7 +5556,7 @@
           <w14:ligatures w14:val="standardContextual"/>
         </w:rPr>
       </w:pPr>
-      <w:hyperlink w:anchor="_Toc243263170" w:history="1">
+      <w:hyperlink w:anchor="_Toc243458912" w:history="1">
         <w:r>
           <w:rPr>
             <w:rStyle w:val="Hipervnculo"/>
@@ -5587,7 +5583,7 @@
             <w:noProof/>
             <w:webHidden/>
           </w:rPr>
-          <w:instrText xml:space="preserve"> PAGEREF _Toc243263170 \h </w:instrText>
+          <w:instrText xml:space="preserve"> PAGEREF _Toc243458912 \h </w:instrText>
         </w:r>
         <w:r>
           <w:rPr>
@@ -5635,7 +5631,7 @@
           <w14:ligatures w14:val="standardContextual"/>
         </w:rPr>
       </w:pPr>
-      <w:hyperlink w:anchor="_Toc243263171" w:history="1">
+      <w:hyperlink w:anchor="_Toc243458913" w:history="1">
         <w:r>
           <w:rPr>
             <w:rStyle w:val="Hipervnculo"/>
@@ -5662,7 +5658,7 @@
             <w:noProof/>
             <w:webHidden/>
           </w:rPr>
-          <w:instrText xml:space="preserve"> PAGEREF _Toc243263171 \h </w:instrText>
+          <w:instrText xml:space="preserve"> PAGEREF _Toc243458913 \h </w:instrText>
         </w:r>
         <w:r>
           <w:rPr>
@@ -5710,7 +5706,7 @@
           <w14:ligatures w14:val="standardContextual"/>
         </w:rPr>
       </w:pPr>
-      <w:hyperlink w:anchor="_Toc243263172" w:history="1">
+      <w:hyperlink w:anchor="_Toc243458914" w:history="1">
         <w:r>
           <w:rPr>
             <w:rStyle w:val="Hipervnculo"/>
@@ -5737,7 +5733,7 @@
             <w:noProof/>
             <w:webHidden/>
           </w:rPr>
-          <w:instrText xml:space="preserve"> PAGEREF _Toc243263172 \h </w:instrText>
+          <w:instrText xml:space="preserve"> PAGEREF _Toc243458914 \h </w:instrText>
         </w:r>
         <w:r>
           <w:rPr>
@@ -5785,7 +5781,7 @@
           <w14:ligatures w14:val="standardContextual"/>
         </w:rPr>
       </w:pPr>
-      <w:hyperlink w:anchor="_Toc243263173" w:history="1">
+      <w:hyperlink w:anchor="_Toc243458915" w:history="1">
         <w:r>
           <w:rPr>
             <w:rStyle w:val="Hipervnculo"/>
@@ -5812,7 +5808,7 @@
             <w:noProof/>
             <w:webHidden/>
           </w:rPr>
-          <w:instrText xml:space="preserve"> PAGEREF _Toc243263173 \h </w:instrText>
+          <w:instrText xml:space="preserve"> PAGEREF _Toc243458915 \h </w:instrText>
         </w:r>
         <w:r>
           <w:rPr>
@@ -5860,7 +5856,7 @@
           <w14:ligatures w14:val="standardContextual"/>
         </w:rPr>
       </w:pPr>
-      <w:hyperlink w:anchor="_Toc243263174" w:history="1">
+      <w:hyperlink w:anchor="_Toc243458916" w:history="1">
         <w:r>
           <w:rPr>
             <w:rStyle w:val="Hipervnculo"/>
@@ -5887,7 +5883,7 @@
             <w:noProof/>
             <w:webHidden/>
           </w:rPr>
-          <w:instrText xml:space="preserve"> PAGEREF _Toc243263174 \h </w:instrText>
+          <w:instrText xml:space="preserve"> PAGEREF _Toc243458916 \h </w:instrText>
         </w:r>
         <w:r>
           <w:rPr>
@@ -5935,7 +5931,7 @@
           <w14:ligatures w14:val="standardContextual"/>
         </w:rPr>
       </w:pPr>
-      <w:hyperlink w:anchor="_Toc243263175" w:history="1">
+      <w:hyperlink w:anchor="_Toc243458917" w:history="1">
         <w:r>
           <w:rPr>
             <w:rStyle w:val="Hipervnculo"/>
@@ -5962,7 +5958,7 @@
             <w:noProof/>
             <w:webHidden/>
           </w:rPr>
-          <w:instrText xml:space="preserve"> PAGEREF _Toc243263175 \h </w:instrText>
+          <w:instrText xml:space="preserve"> PAGEREF _Toc243458917 \h </w:instrText>
         </w:r>
         <w:r>
           <w:rPr>
@@ -6010,7 +6006,7 @@
           <w14:ligatures w14:val="standardContextual"/>
         </w:rPr>
       </w:pPr>
-      <w:hyperlink w:anchor="_Toc243263176" w:history="1">
+      <w:hyperlink w:anchor="_Toc243458918" w:history="1">
         <w:r>
           <w:rPr>
             <w:rStyle w:val="Hipervnculo"/>
@@ -6037,7 +6033,7 @@
             <w:noProof/>
             <w:webHidden/>
           </w:rPr>
-          <w:instrText xml:space="preserve"> PAGEREF _Toc243263176 \h </w:instrText>
+          <w:instrText xml:space="preserve"> PAGEREF _Toc243458918 \h </w:instrText>
         </w:r>
         <w:r>
           <w:rPr>
@@ -6085,7 +6081,7 @@
           <w14:ligatures w14:val="standardContextual"/>
         </w:rPr>
       </w:pPr>
-      <w:hyperlink w:anchor="_Toc243263177" w:history="1">
+      <w:hyperlink w:anchor="_Toc243458919" w:history="1">
         <w:r>
           <w:rPr>
             <w:rStyle w:val="Hipervnculo"/>
@@ -6112,7 +6108,7 @@
             <w:noProof/>
             <w:webHidden/>
           </w:rPr>
-          <w:instrText xml:space="preserve"> PAGEREF _Toc243263177 \h </w:instrText>
+          <w:instrText xml:space="preserve"> PAGEREF _Toc243458919 \h </w:instrText>
         </w:r>
         <w:r>
           <w:rPr>
@@ -6160,7 +6156,7 @@
           <w14:ligatures w14:val="standardContextual"/>
         </w:rPr>
       </w:pPr>
-      <w:hyperlink w:anchor="_Toc243263178" w:history="1">
+      <w:hyperlink w:anchor="_Toc243458920" w:history="1">
         <w:r>
           <w:rPr>
             <w:rStyle w:val="Hipervnculo"/>
@@ -6187,7 +6183,7 @@
             <w:noProof/>
             <w:webHidden/>
           </w:rPr>
-          <w:instrText xml:space="preserve"> PAGEREF _Toc243263178 \h </w:instrText>
+          <w:instrText xml:space="preserve"> PAGEREF _Toc243458920 \h </w:instrText>
         </w:r>
         <w:r>
           <w:rPr>
@@ -6235,7 +6231,7 @@
           <w14:ligatures w14:val="standardContextual"/>
         </w:rPr>
       </w:pPr>
-      <w:hyperlink w:anchor="_Toc243263179" w:history="1">
+      <w:hyperlink w:anchor="_Toc243458921" w:history="1">
         <w:r>
           <w:rPr>
             <w:rStyle w:val="Hipervnculo"/>
@@ -6262,7 +6258,7 @@
             <w:noProof/>
             <w:webHidden/>
           </w:rPr>
-          <w:instrText xml:space="preserve"> PAGEREF _Toc243263179 \h </w:instrText>
+          <w:instrText xml:space="preserve"> PAGEREF _Toc243458921 \h </w:instrText>
         </w:r>
         <w:r>
           <w:rPr>
@@ -6310,7 +6306,7 @@
           <w14:ligatures w14:val="standardContextual"/>
         </w:rPr>
       </w:pPr>
-      <w:hyperlink w:anchor="_Toc243263180" w:history="1">
+      <w:hyperlink w:anchor="_Toc243458922" w:history="1">
         <w:r>
           <w:rPr>
             <w:rStyle w:val="Hipervnculo"/>
@@ -6337,7 +6333,7 @@
             <w:noProof/>
             <w:webHidden/>
           </w:rPr>
-          <w:instrText xml:space="preserve"> PAGEREF _Toc243263180 \h </w:instrText>
+          <w:instrText xml:space="preserve"> PAGEREF _Toc243458922 \h </w:instrText>
         </w:r>
         <w:r>
           <w:rPr>
@@ -6385,7 +6381,7 @@
           <w14:ligatures w14:val="standardContextual"/>
         </w:rPr>
       </w:pPr>
-      <w:hyperlink w:anchor="_Toc243263181" w:history="1">
+      <w:hyperlink w:anchor="_Toc243458923" w:history="1">
         <w:r>
           <w:rPr>
             <w:rStyle w:val="Hipervnculo"/>
@@ -6412,7 +6408,7 @@
             <w:noProof/>
             <w:webHidden/>
           </w:rPr>
-          <w:instrText xml:space="preserve"> PAGEREF _Toc243263181 \h </w:instrText>
+          <w:instrText xml:space="preserve"> PAGEREF _Toc243458923 \h </w:instrText>
         </w:r>
         <w:r>
           <w:rPr>
@@ -6504,7 +6500,7 @@
       <w:r>
         <w:fldChar w:fldCharType="separate"/>
       </w:r>
-      <w:hyperlink w:anchor="_Toc243263182" w:history="1">
+      <w:hyperlink w:anchor="_Toc243458924" w:history="1">
         <w:r>
           <w:rPr>
             <w:rStyle w:val="Hipervnculo"/>
@@ -6531,7 +6527,7 @@
             <w:noProof/>
             <w:webHidden/>
           </w:rPr>
-          <w:instrText xml:space="preserve"> PAGEREF _Toc243263182 \h </w:instrText>
+          <w:instrText xml:space="preserve"> PAGEREF _Toc243458924 \h </w:instrText>
         </w:r>
         <w:r>
           <w:rPr>
@@ -6591,7 +6587,6 @@
           <w:b/>
           <w:sz w:val="32"/>
         </w:rPr>
-        <w:lastRenderedPageBreak/>
         <w:t>ÍNDICE DE TABLAS</w:t>
       </w:r>
     </w:p>
@@ -6622,7 +6617,7 @@
       <w:r>
         <w:fldChar w:fldCharType="separate"/>
       </w:r>
-      <w:hyperlink w:anchor="_Toc243263183" w:history="1">
+      <w:hyperlink w:anchor="_Toc243458925" w:history="1">
         <w:r>
           <w:rPr>
             <w:rStyle w:val="Hipervnculo"/>
@@ -6649,7 +6644,7 @@
             <w:noProof/>
             <w:webHidden/>
           </w:rPr>
-          <w:instrText xml:space="preserve"> PAGEREF _Toc243263183 \h </w:instrText>
+          <w:instrText xml:space="preserve"> PAGEREF _Toc243458925 \h </w:instrText>
         </w:r>
         <w:r>
           <w:rPr>
@@ -6697,7 +6692,7 @@
           <w14:ligatures w14:val="standardContextual"/>
         </w:rPr>
       </w:pPr>
-      <w:hyperlink w:anchor="_Toc243263184" w:history="1">
+      <w:hyperlink w:anchor="_Toc243458926" w:history="1">
         <w:r>
           <w:rPr>
             <w:rStyle w:val="Hipervnculo"/>
@@ -6724,7 +6719,7 @@
             <w:noProof/>
             <w:webHidden/>
           </w:rPr>
-          <w:instrText xml:space="preserve"> PAGEREF _Toc243263184 \h </w:instrText>
+          <w:instrText xml:space="preserve"> PAGEREF _Toc243458926 \h </w:instrText>
         </w:r>
         <w:r>
           <w:rPr>
@@ -6772,7 +6767,7 @@
           <w14:ligatures w14:val="standardContextual"/>
         </w:rPr>
       </w:pPr>
-      <w:hyperlink w:anchor="_Toc243263185" w:history="1">
+      <w:hyperlink w:anchor="_Toc243458927" w:history="1">
         <w:r>
           <w:rPr>
             <w:rStyle w:val="Hipervnculo"/>
@@ -6799,7 +6794,7 @@
             <w:noProof/>
             <w:webHidden/>
           </w:rPr>
-          <w:instrText xml:space="preserve"> PAGEREF _Toc243263185 \h </w:instrText>
+          <w:instrText xml:space="preserve"> PAGEREF _Toc243458927 \h </w:instrText>
         </w:r>
         <w:r>
           <w:rPr>
@@ -6847,7 +6842,7 @@
           <w14:ligatures w14:val="standardContextual"/>
         </w:rPr>
       </w:pPr>
-      <w:hyperlink w:anchor="_Toc243263186" w:history="1">
+      <w:hyperlink w:anchor="_Toc243458928" w:history="1">
         <w:r>
           <w:rPr>
             <w:rStyle w:val="Hipervnculo"/>
@@ -6874,7 +6869,7 @@
             <w:noProof/>
             <w:webHidden/>
           </w:rPr>
-          <w:instrText xml:space="preserve"> PAGEREF _Toc243263186 \h </w:instrText>
+          <w:instrText xml:space="preserve"> PAGEREF _Toc243458928 \h </w:instrText>
         </w:r>
         <w:r>
           <w:rPr>
@@ -6922,7 +6917,7 @@
           <w14:ligatures w14:val="standardContextual"/>
         </w:rPr>
       </w:pPr>
-      <w:hyperlink w:anchor="_Toc243263187" w:history="1">
+      <w:hyperlink w:anchor="_Toc243458929" w:history="1">
         <w:r>
           <w:rPr>
             <w:rStyle w:val="Hipervnculo"/>
@@ -6949,7 +6944,7 @@
             <w:noProof/>
             <w:webHidden/>
           </w:rPr>
-          <w:instrText xml:space="preserve"> PAGEREF _Toc243263187 \h </w:instrText>
+          <w:instrText xml:space="preserve"> PAGEREF _Toc243458929 \h </w:instrText>
         </w:r>
         <w:r>
           <w:rPr>
@@ -6997,7 +6992,7 @@
           <w14:ligatures w14:val="standardContextual"/>
         </w:rPr>
       </w:pPr>
-      <w:hyperlink w:anchor="_Toc243263188" w:history="1">
+      <w:hyperlink w:anchor="_Toc243458930" w:history="1">
         <w:r>
           <w:rPr>
             <w:rStyle w:val="Hipervnculo"/>
@@ -7024,7 +7019,7 @@
             <w:noProof/>
             <w:webHidden/>
           </w:rPr>
-          <w:instrText xml:space="preserve"> PAGEREF _Toc243263188 \h </w:instrText>
+          <w:instrText xml:space="preserve"> PAGEREF _Toc243458930 \h </w:instrText>
         </w:r>
         <w:r>
           <w:rPr>
@@ -7072,7 +7067,7 @@
           <w14:ligatures w14:val="standardContextual"/>
         </w:rPr>
       </w:pPr>
-      <w:hyperlink w:anchor="_Toc243263189" w:history="1">
+      <w:hyperlink w:anchor="_Toc243458931" w:history="1">
         <w:r>
           <w:rPr>
             <w:rStyle w:val="Hipervnculo"/>
@@ -7099,7 +7094,7 @@
             <w:noProof/>
             <w:webHidden/>
           </w:rPr>
-          <w:instrText xml:space="preserve"> PAGEREF _Toc243263189 \h </w:instrText>
+          <w:instrText xml:space="preserve"> PAGEREF _Toc243458931 \h </w:instrText>
         </w:r>
         <w:r>
           <w:rPr>
@@ -7147,7 +7142,7 @@
           <w14:ligatures w14:val="standardContextual"/>
         </w:rPr>
       </w:pPr>
-      <w:hyperlink w:anchor="_Toc243263190" w:history="1">
+      <w:hyperlink w:anchor="_Toc243458932" w:history="1">
         <w:r>
           <w:rPr>
             <w:rStyle w:val="Hipervnculo"/>
@@ -7174,7 +7169,7 @@
             <w:noProof/>
             <w:webHidden/>
           </w:rPr>
-          <w:instrText xml:space="preserve"> PAGEREF _Toc243263190 \h </w:instrText>
+          <w:instrText xml:space="preserve"> PAGEREF _Toc243458932 \h </w:instrText>
         </w:r>
         <w:r>
           <w:rPr>
@@ -7222,7 +7217,7 @@
           <w14:ligatures w14:val="standardContextual"/>
         </w:rPr>
       </w:pPr>
-      <w:hyperlink w:anchor="_Toc243263191" w:history="1">
+      <w:hyperlink w:anchor="_Toc243458933" w:history="1">
         <w:r>
           <w:rPr>
             <w:rStyle w:val="Hipervnculo"/>
@@ -7249,7 +7244,7 @@
             <w:noProof/>
             <w:webHidden/>
           </w:rPr>
-          <w:instrText xml:space="preserve"> PAGEREF _Toc243263191 \h </w:instrText>
+          <w:instrText xml:space="preserve"> PAGEREF _Toc243458933 \h </w:instrText>
         </w:r>
         <w:r>
           <w:rPr>
@@ -7297,7 +7292,7 @@
           <w14:ligatures w14:val="standardContextual"/>
         </w:rPr>
       </w:pPr>
-      <w:hyperlink w:anchor="_Toc243263192" w:history="1">
+      <w:hyperlink w:anchor="_Toc243458934" w:history="1">
         <w:r>
           <w:rPr>
             <w:rStyle w:val="Hipervnculo"/>
@@ -7324,7 +7319,7 @@
             <w:noProof/>
             <w:webHidden/>
           </w:rPr>
-          <w:instrText xml:space="preserve"> PAGEREF _Toc243263192 \h </w:instrText>
+          <w:instrText xml:space="preserve"> PAGEREF _Toc243458934 \h </w:instrText>
         </w:r>
         <w:r>
           <w:rPr>
@@ -7372,7 +7367,7 @@
           <w14:ligatures w14:val="standardContextual"/>
         </w:rPr>
       </w:pPr>
-      <w:hyperlink w:anchor="_Toc243263193" w:history="1">
+      <w:hyperlink w:anchor="_Toc243458935" w:history="1">
         <w:r>
           <w:rPr>
             <w:rStyle w:val="Hipervnculo"/>
@@ -7399,7 +7394,7 @@
             <w:noProof/>
             <w:webHidden/>
           </w:rPr>
-          <w:instrText xml:space="preserve"> PAGEREF _Toc243263193 \h </w:instrText>
+          <w:instrText xml:space="preserve"> PAGEREF _Toc243458935 \h </w:instrText>
         </w:r>
         <w:r>
           <w:rPr>
@@ -7447,7 +7442,7 @@
           <w14:ligatures w14:val="standardContextual"/>
         </w:rPr>
       </w:pPr>
-      <w:hyperlink w:anchor="_Toc243263194" w:history="1">
+      <w:hyperlink w:anchor="_Toc243458936" w:history="1">
         <w:r>
           <w:rPr>
             <w:rStyle w:val="Hipervnculo"/>
@@ -7474,7 +7469,7 @@
             <w:noProof/>
             <w:webHidden/>
           </w:rPr>
-          <w:instrText xml:space="preserve"> PAGEREF _Toc243263194 \h </w:instrText>
+          <w:instrText xml:space="preserve"> PAGEREF _Toc243458936 \h </w:instrText>
         </w:r>
         <w:r>
           <w:rPr>
@@ -7522,7 +7517,7 @@
           <w14:ligatures w14:val="standardContextual"/>
         </w:rPr>
       </w:pPr>
-      <w:hyperlink w:anchor="_Toc243263195" w:history="1">
+      <w:hyperlink w:anchor="_Toc243458937" w:history="1">
         <w:r>
           <w:rPr>
             <w:rStyle w:val="Hipervnculo"/>
@@ -7549,7 +7544,7 @@
             <w:noProof/>
             <w:webHidden/>
           </w:rPr>
-          <w:instrText xml:space="preserve"> PAGEREF _Toc243263195 \h </w:instrText>
+          <w:instrText xml:space="preserve"> PAGEREF _Toc243458937 \h </w:instrText>
         </w:r>
         <w:r>
           <w:rPr>
@@ -7597,7 +7592,7 @@
           <w14:ligatures w14:val="standardContextual"/>
         </w:rPr>
       </w:pPr>
-      <w:hyperlink w:anchor="_Toc243263196" w:history="1">
+      <w:hyperlink w:anchor="_Toc243458938" w:history="1">
         <w:r>
           <w:rPr>
             <w:rStyle w:val="Hipervnculo"/>
@@ -7624,7 +7619,7 @@
             <w:noProof/>
             <w:webHidden/>
           </w:rPr>
-          <w:instrText xml:space="preserve"> PAGEREF _Toc243263196 \h </w:instrText>
+          <w:instrText xml:space="preserve"> PAGEREF _Toc243458938 \h </w:instrText>
         </w:r>
         <w:r>
           <w:rPr>
@@ -7672,7 +7667,7 @@
           <w14:ligatures w14:val="standardContextual"/>
         </w:rPr>
       </w:pPr>
-      <w:hyperlink w:anchor="_Toc243263197" w:history="1">
+      <w:hyperlink w:anchor="_Toc243458939" w:history="1">
         <w:r>
           <w:rPr>
             <w:rStyle w:val="Hipervnculo"/>
@@ -7699,7 +7694,7 @@
             <w:noProof/>
             <w:webHidden/>
           </w:rPr>
-          <w:instrText xml:space="preserve"> PAGEREF _Toc243263197 \h </w:instrText>
+          <w:instrText xml:space="preserve"> PAGEREF _Toc243458939 \h </w:instrText>
         </w:r>
         <w:r>
           <w:rPr>
@@ -7747,7 +7742,7 @@
           <w14:ligatures w14:val="standardContextual"/>
         </w:rPr>
       </w:pPr>
-      <w:hyperlink w:anchor="_Toc243263198" w:history="1">
+      <w:hyperlink w:anchor="_Toc243458940" w:history="1">
         <w:r>
           <w:rPr>
             <w:rStyle w:val="Hipervnculo"/>
@@ -7774,7 +7769,7 @@
             <w:noProof/>
             <w:webHidden/>
           </w:rPr>
-          <w:instrText xml:space="preserve"> PAGEREF _Toc243263198 \h </w:instrText>
+          <w:instrText xml:space="preserve"> PAGEREF _Toc243458940 \h </w:instrText>
         </w:r>
         <w:r>
           <w:rPr>
@@ -7822,7 +7817,7 @@
           <w14:ligatures w14:val="standardContextual"/>
         </w:rPr>
       </w:pPr>
-      <w:hyperlink w:anchor="_Toc243263199" w:history="1">
+      <w:hyperlink w:anchor="_Toc243458941" w:history="1">
         <w:r>
           <w:rPr>
             <w:rStyle w:val="Hipervnculo"/>
@@ -7849,7 +7844,7 @@
             <w:noProof/>
             <w:webHidden/>
           </w:rPr>
-          <w:instrText xml:space="preserve"> PAGEREF _Toc243263199 \h </w:instrText>
+          <w:instrText xml:space="preserve"> PAGEREF _Toc243458941 \h </w:instrText>
         </w:r>
         <w:r>
           <w:rPr>
@@ -7897,7 +7892,7 @@
           <w14:ligatures w14:val="standardContextual"/>
         </w:rPr>
       </w:pPr>
-      <w:hyperlink w:anchor="_Toc243263200" w:history="1">
+      <w:hyperlink w:anchor="_Toc243458942" w:history="1">
         <w:r>
           <w:rPr>
             <w:rStyle w:val="Hipervnculo"/>
@@ -7924,7 +7919,7 @@
             <w:noProof/>
             <w:webHidden/>
           </w:rPr>
-          <w:instrText xml:space="preserve"> PAGEREF _Toc243263200 \h </w:instrText>
+          <w:instrText xml:space="preserve"> PAGEREF _Toc243458942 \h </w:instrText>
         </w:r>
         <w:r>
           <w:rPr>
@@ -7972,7 +7967,7 @@
           <w14:ligatures w14:val="standardContextual"/>
         </w:rPr>
       </w:pPr>
-      <w:hyperlink w:anchor="_Toc243263201" w:history="1">
+      <w:hyperlink w:anchor="_Toc243458943" w:history="1">
         <w:r>
           <w:rPr>
             <w:rStyle w:val="Hipervnculo"/>
@@ -7999,7 +7994,7 @@
             <w:noProof/>
             <w:webHidden/>
           </w:rPr>
-          <w:instrText xml:space="preserve"> PAGEREF _Toc243263201 \h </w:instrText>
+          <w:instrText xml:space="preserve"> PAGEREF _Toc243458943 \h </w:instrText>
         </w:r>
         <w:r>
           <w:rPr>
@@ -8047,7 +8042,7 @@
           <w14:ligatures w14:val="standardContextual"/>
         </w:rPr>
       </w:pPr>
-      <w:hyperlink w:anchor="_Toc243263202" w:history="1">
+      <w:hyperlink w:anchor="_Toc243458944" w:history="1">
         <w:r>
           <w:rPr>
             <w:rStyle w:val="Hipervnculo"/>
@@ -8074,7 +8069,7 @@
             <w:noProof/>
             <w:webHidden/>
           </w:rPr>
-          <w:instrText xml:space="preserve"> PAGEREF _Toc243263202 \h </w:instrText>
+          <w:instrText xml:space="preserve"> PAGEREF _Toc243458944 \h </w:instrText>
         </w:r>
         <w:r>
           <w:rPr>
@@ -8122,7 +8117,7 @@
           <w14:ligatures w14:val="standardContextual"/>
         </w:rPr>
       </w:pPr>
-      <w:hyperlink w:anchor="_Toc243263203" w:history="1">
+      <w:hyperlink w:anchor="_Toc243458945" w:history="1">
         <w:r>
           <w:rPr>
             <w:rStyle w:val="Hipervnculo"/>
@@ -8149,7 +8144,7 @@
             <w:noProof/>
             <w:webHidden/>
           </w:rPr>
-          <w:instrText xml:space="preserve"> PAGEREF _Toc243263203 \h </w:instrText>
+          <w:instrText xml:space="preserve"> PAGEREF _Toc243458945 \h </w:instrText>
         </w:r>
         <w:r>
           <w:rPr>
@@ -8197,7 +8192,7 @@
           <w14:ligatures w14:val="standardContextual"/>
         </w:rPr>
       </w:pPr>
-      <w:hyperlink w:anchor="_Toc243263204" w:history="1">
+      <w:hyperlink w:anchor="_Toc243458946" w:history="1">
         <w:r>
           <w:rPr>
             <w:rStyle w:val="Hipervnculo"/>
@@ -8224,7 +8219,7 @@
             <w:noProof/>
             <w:webHidden/>
           </w:rPr>
-          <w:instrText xml:space="preserve"> PAGEREF _Toc243263204 \h </w:instrText>
+          <w:instrText xml:space="preserve"> PAGEREF _Toc243458946 \h </w:instrText>
         </w:r>
         <w:r>
           <w:rPr>
@@ -8272,7 +8267,7 @@
           <w14:ligatures w14:val="standardContextual"/>
         </w:rPr>
       </w:pPr>
-      <w:hyperlink w:anchor="_Toc243263205" w:history="1">
+      <w:hyperlink w:anchor="_Toc243458947" w:history="1">
         <w:r>
           <w:rPr>
             <w:rStyle w:val="Hipervnculo"/>
@@ -8299,7 +8294,7 @@
             <w:noProof/>
             <w:webHidden/>
           </w:rPr>
-          <w:instrText xml:space="preserve"> PAGEREF _Toc243263205 \h </w:instrText>
+          <w:instrText xml:space="preserve"> PAGEREF _Toc243458947 \h </w:instrText>
         </w:r>
         <w:r>
           <w:rPr>
@@ -8347,7 +8342,7 @@
           <w14:ligatures w14:val="standardContextual"/>
         </w:rPr>
       </w:pPr>
-      <w:hyperlink w:anchor="_Toc243263206" w:history="1">
+      <w:hyperlink w:anchor="_Toc243458948" w:history="1">
         <w:r>
           <w:rPr>
             <w:rStyle w:val="Hipervnculo"/>
@@ -8374,7 +8369,7 @@
             <w:noProof/>
             <w:webHidden/>
           </w:rPr>
-          <w:instrText xml:space="preserve"> PAGEREF _Toc243263206 \h </w:instrText>
+          <w:instrText xml:space="preserve"> PAGEREF _Toc243458948 \h </w:instrText>
         </w:r>
         <w:r>
           <w:rPr>
@@ -8422,7 +8417,7 @@
           <w14:ligatures w14:val="standardContextual"/>
         </w:rPr>
       </w:pPr>
-      <w:hyperlink w:anchor="_Toc243263207" w:history="1">
+      <w:hyperlink w:anchor="_Toc243458949" w:history="1">
         <w:r>
           <w:rPr>
             <w:rStyle w:val="Hipervnculo"/>
@@ -8449,7 +8444,7 @@
             <w:noProof/>
             <w:webHidden/>
           </w:rPr>
-          <w:instrText xml:space="preserve"> PAGEREF _Toc243263207 \h </w:instrText>
+          <w:instrText xml:space="preserve"> PAGEREF _Toc243458949 \h </w:instrText>
         </w:r>
         <w:r>
           <w:rPr>
@@ -8497,7 +8492,7 @@
           <w14:ligatures w14:val="standardContextual"/>
         </w:rPr>
       </w:pPr>
-      <w:hyperlink w:anchor="_Toc243263208" w:history="1">
+      <w:hyperlink w:anchor="_Toc243458950" w:history="1">
         <w:r>
           <w:rPr>
             <w:rStyle w:val="Hipervnculo"/>
@@ -8524,7 +8519,7 @@
             <w:noProof/>
             <w:webHidden/>
           </w:rPr>
-          <w:instrText xml:space="preserve"> PAGEREF _Toc243263208 \h </w:instrText>
+          <w:instrText xml:space="preserve"> PAGEREF _Toc243458950 \h </w:instrText>
         </w:r>
         <w:r>
           <w:rPr>
@@ -8572,7 +8567,7 @@
           <w14:ligatures w14:val="standardContextual"/>
         </w:rPr>
       </w:pPr>
-      <w:hyperlink w:anchor="_Toc243263209" w:history="1">
+      <w:hyperlink w:anchor="_Toc243458951" w:history="1">
         <w:r>
           <w:rPr>
             <w:rStyle w:val="Hipervnculo"/>
@@ -8599,7 +8594,7 @@
             <w:noProof/>
             <w:webHidden/>
           </w:rPr>
-          <w:instrText xml:space="preserve"> PAGEREF _Toc243263209 \h </w:instrText>
+          <w:instrText xml:space="preserve"> PAGEREF _Toc243458951 \h </w:instrText>
         </w:r>
         <w:r>
           <w:rPr>
@@ -8647,7 +8642,7 @@
           <w14:ligatures w14:val="standardContextual"/>
         </w:rPr>
       </w:pPr>
-      <w:hyperlink w:anchor="_Toc243263210" w:history="1">
+      <w:hyperlink w:anchor="_Toc243458952" w:history="1">
         <w:r>
           <w:rPr>
             <w:rStyle w:val="Hipervnculo"/>
@@ -8674,7 +8669,7 @@
             <w:noProof/>
             <w:webHidden/>
           </w:rPr>
-          <w:instrText xml:space="preserve"> PAGEREF _Toc243263210 \h </w:instrText>
+          <w:instrText xml:space="preserve"> PAGEREF _Toc243458952 \h </w:instrText>
         </w:r>
         <w:r>
           <w:rPr>
@@ -8722,7 +8717,7 @@
           <w14:ligatures w14:val="standardContextual"/>
         </w:rPr>
       </w:pPr>
-      <w:hyperlink w:anchor="_Toc243263211" w:history="1">
+      <w:hyperlink w:anchor="_Toc243458953" w:history="1">
         <w:r>
           <w:rPr>
             <w:rStyle w:val="Hipervnculo"/>
@@ -8749,7 +8744,7 @@
             <w:noProof/>
             <w:webHidden/>
           </w:rPr>
-          <w:instrText xml:space="preserve"> PAGEREF _Toc243263211 \h </w:instrText>
+          <w:instrText xml:space="preserve"> PAGEREF _Toc243458953 \h </w:instrText>
         </w:r>
         <w:r>
           <w:rPr>
@@ -8797,7 +8792,7 @@
           <w14:ligatures w14:val="standardContextual"/>
         </w:rPr>
       </w:pPr>
-      <w:hyperlink w:anchor="_Toc243263212" w:history="1">
+      <w:hyperlink w:anchor="_Toc243458954" w:history="1">
         <w:r>
           <w:rPr>
             <w:rStyle w:val="Hipervnculo"/>
@@ -8824,7 +8819,7 @@
             <w:noProof/>
             <w:webHidden/>
           </w:rPr>
-          <w:instrText xml:space="preserve"> PAGEREF _Toc243263212 \h </w:instrText>
+          <w:instrText xml:space="preserve"> PAGEREF _Toc243458954 \h </w:instrText>
         </w:r>
         <w:r>
           <w:rPr>
@@ -8872,7 +8867,7 @@
           <w14:ligatures w14:val="standardContextual"/>
         </w:rPr>
       </w:pPr>
-      <w:hyperlink w:anchor="_Toc243263213" w:history="1">
+      <w:hyperlink w:anchor="_Toc243458955" w:history="1">
         <w:r>
           <w:rPr>
             <w:rStyle w:val="Hipervnculo"/>
@@ -8899,7 +8894,7 @@
             <w:noProof/>
             <w:webHidden/>
           </w:rPr>
-          <w:instrText xml:space="preserve"> PAGEREF _Toc243263213 \h </w:instrText>
+          <w:instrText xml:space="preserve"> PAGEREF _Toc243458955 \h </w:instrText>
         </w:r>
         <w:r>
           <w:rPr>
@@ -8947,7 +8942,7 @@
           <w14:ligatures w14:val="standardContextual"/>
         </w:rPr>
       </w:pPr>
-      <w:hyperlink w:anchor="_Toc243263214" w:history="1">
+      <w:hyperlink w:anchor="_Toc243458956" w:history="1">
         <w:r>
           <w:rPr>
             <w:rStyle w:val="Hipervnculo"/>
@@ -8974,7 +8969,7 @@
             <w:noProof/>
             <w:webHidden/>
           </w:rPr>
-          <w:instrText xml:space="preserve"> PAGEREF _Toc243263214 \h </w:instrText>
+          <w:instrText xml:space="preserve"> PAGEREF _Toc243458956 \h </w:instrText>
         </w:r>
         <w:r>
           <w:rPr>
@@ -9022,7 +9017,7 @@
           <w14:ligatures w14:val="standardContextual"/>
         </w:rPr>
       </w:pPr>
-      <w:hyperlink w:anchor="_Toc243263215" w:history="1">
+      <w:hyperlink w:anchor="_Toc243458957" w:history="1">
         <w:r>
           <w:rPr>
             <w:rStyle w:val="Hipervnculo"/>
@@ -9049,7 +9044,7 @@
             <w:noProof/>
             <w:webHidden/>
           </w:rPr>
-          <w:instrText xml:space="preserve"> PAGEREF _Toc243263215 \h </w:instrText>
+          <w:instrText xml:space="preserve"> PAGEREF _Toc243458957 \h </w:instrText>
         </w:r>
         <w:r>
           <w:rPr>
@@ -9097,7 +9092,7 @@
           <w14:ligatures w14:val="standardContextual"/>
         </w:rPr>
       </w:pPr>
-      <w:hyperlink w:anchor="_Toc243263216" w:history="1">
+      <w:hyperlink w:anchor="_Toc243458958" w:history="1">
         <w:r>
           <w:rPr>
             <w:rStyle w:val="Hipervnculo"/>
@@ -9124,7 +9119,7 @@
             <w:noProof/>
             <w:webHidden/>
           </w:rPr>
-          <w:instrText xml:space="preserve"> PAGEREF _Toc243263216 \h </w:instrText>
+          <w:instrText xml:space="preserve"> PAGEREF _Toc243458958 \h </w:instrText>
         </w:r>
         <w:r>
           <w:rPr>
@@ -9172,7 +9167,7 @@
           <w14:ligatures w14:val="standardContextual"/>
         </w:rPr>
       </w:pPr>
-      <w:hyperlink w:anchor="_Toc243263217" w:history="1">
+      <w:hyperlink w:anchor="_Toc243458959" w:history="1">
         <w:r>
           <w:rPr>
             <w:rStyle w:val="Hipervnculo"/>
@@ -9199,7 +9194,7 @@
             <w:noProof/>
             <w:webHidden/>
           </w:rPr>
-          <w:instrText xml:space="preserve"> PAGEREF _Toc243263217 \h </w:instrText>
+          <w:instrText xml:space="preserve"> PAGEREF _Toc243458959 \h </w:instrText>
         </w:r>
         <w:r>
           <w:rPr>
@@ -9247,7 +9242,7 @@
           <w14:ligatures w14:val="standardContextual"/>
         </w:rPr>
       </w:pPr>
-      <w:hyperlink w:anchor="_Toc243263218" w:history="1">
+      <w:hyperlink w:anchor="_Toc243458960" w:history="1">
         <w:r>
           <w:rPr>
             <w:rStyle w:val="Hipervnculo"/>
@@ -9274,7 +9269,7 @@
             <w:noProof/>
             <w:webHidden/>
           </w:rPr>
-          <w:instrText xml:space="preserve"> PAGEREF _Toc243263218 \h </w:instrText>
+          <w:instrText xml:space="preserve"> PAGEREF _Toc243458960 \h </w:instrText>
         </w:r>
         <w:r>
           <w:rPr>
@@ -9307,7 +9302,6 @@
     </w:p>
     <w:p>
       <w:r>
-        <w:lastRenderedPageBreak/>
         <w:fldChar w:fldCharType="end"/>
       </w:r>
     </w:p>
@@ -9316,7 +9310,7 @@
         <w:pStyle w:val="Ttulo1"/>
       </w:pPr>
       <w:bookmarkStart w:id="0" w:name="_886y0px15ceg" w:colFirst="0" w:colLast="0"/>
-      <w:bookmarkStart w:id="1" w:name="_Toc243263136"/>
+      <w:bookmarkStart w:id="1" w:name="_Toc243458878"/>
       <w:bookmarkEnd w:id="0"/>
       <w:r>
         <w:t>CASO DE ESTUDIO</w:t>
@@ -9402,15 +9396,7 @@
         </w:pBdr>
       </w:pPr>
       <w:r>
-        <w:t xml:space="preserve">Multicanal: la aplicación se entrega como cliente de consola, cliente de escritorio (Java Swing), aplicación web y aplicación móvil (Android). Todos usan el mismo servicio </w:t>
-      </w:r>
-      <w:proofErr w:type="spellStart"/>
-      <w:r>
-        <w:t>backend</w:t>
-      </w:r>
-      <w:proofErr w:type="spellEnd"/>
-      <w:r>
-        <w:t>, así que el resultado es el mismo sin importar desde dónde se haga la conversión.</w:t>
+        <w:t>Multicanal: la aplicación se entrega como cliente de consola, cliente de escritorio (Java Swing), aplicación web y aplicación móvil (Android). Todos usan el mismo servicio backend, así que el resultado es el mismo sin importar desde dónde se haga la conversión.</w:t>
       </w:r>
     </w:p>
     <w:p>
@@ -9561,11 +9547,7 @@
     </w:p>
     <w:p>
       <w:r>
-        <w:t xml:space="preserve">1. Autenticación y sesión: recibir credenciales, validarlas en memoria, emitir un token temporal y </w:t>
-      </w:r>
-      <w:r>
-        <w:lastRenderedPageBreak/>
-        <w:t>rechazar las peticiones sin autorización.</w:t>
+        <w:t>1. Autenticación y sesión: recibir credenciales, validarlas en memoria, emitir un token temporal y rechazar las peticiones sin autorización.</w:t>
       </w:r>
     </w:p>
     <w:p>
@@ -9602,8 +9584,8 @@
     <w:p>
       <w:pPr>
         <w:sectPr>
-          <w:headerReference w:type="default" r:id="rId14"/>
-          <w:footerReference w:type="default" r:id="rId15"/>
+          <w:headerReference w:type="default" r:id="rId9"/>
+          <w:footerReference w:type="default" r:id="rId10"/>
           <w:pgSz w:w="11906" w:h="16838"/>
           <w:pgMar w:top="1440" w:right="1440" w:bottom="1440" w:left="1440" w:header="0" w:footer="996" w:gutter="0"/>
           <w:pgBorders w:offsetFrom="page">
@@ -9622,10 +9604,9 @@
         <w:spacing w:before="0" w:after="0" w:line="240" w:lineRule="auto"/>
       </w:pPr>
       <w:bookmarkStart w:id="2" w:name="_n3yw18a7brw5" w:colFirst="0" w:colLast="0"/>
-      <w:bookmarkStart w:id="3" w:name="_Toc243263137"/>
+      <w:bookmarkStart w:id="3" w:name="_Toc243458879"/>
       <w:bookmarkEnd w:id="2"/>
       <w:r>
-        <w:lastRenderedPageBreak/>
         <w:t xml:space="preserve">1. </w:t>
       </w:r>
       <w:r>
@@ -9649,7 +9630,7 @@
         <w:spacing w:before="0" w:after="0" w:line="240" w:lineRule="auto"/>
       </w:pPr>
       <w:bookmarkStart w:id="4" w:name="_lk98sn8exlks" w:colFirst="0" w:colLast="0"/>
-      <w:bookmarkStart w:id="5" w:name="_Toc243263138"/>
+      <w:bookmarkStart w:id="5" w:name="_Toc243458880"/>
       <w:bookmarkEnd w:id="4"/>
       <w:r>
         <w:t xml:space="preserve">2. </w:t>
@@ -9672,15 +9653,7 @@
         <w:spacing w:before="0" w:after="0"/>
       </w:pPr>
       <w:r>
-        <w:t xml:space="preserve">Además, el documento sirve como punto de acuerdo para diseñar, desarrollar y evaluar el </w:t>
-      </w:r>
-      <w:proofErr w:type="spellStart"/>
-      <w:r>
-        <w:t>backend</w:t>
-      </w:r>
-      <w:proofErr w:type="spellEnd"/>
-      <w:r>
-        <w:t xml:space="preserve"> SOAP y sus clientes de consola, escritorio, web y móvil.</w:t>
+        <w:t>Además, el documento sirve como punto de acuerdo para diseñar, desarrollar y evaluar el backend SOAP y sus clientes de consola, escritorio, web y móvil.</w:t>
       </w:r>
     </w:p>
     <w:p>
@@ -9694,7 +9667,7 @@
         <w:spacing w:before="0" w:after="0" w:line="240" w:lineRule="auto"/>
       </w:pPr>
       <w:bookmarkStart w:id="6" w:name="_qegie812bku2" w:colFirst="0" w:colLast="0"/>
-      <w:bookmarkStart w:id="7" w:name="_Toc243263139"/>
+      <w:bookmarkStart w:id="7" w:name="_Toc243458881"/>
       <w:bookmarkEnd w:id="6"/>
       <w:r>
         <w:t xml:space="preserve">3. </w:t>
@@ -9804,15 +9777,7 @@
         <w:spacing w:before="0" w:after="0"/>
       </w:pPr>
       <w:r>
-        <w:t xml:space="preserve">Control de acceso de los </w:t>
-      </w:r>
-      <w:proofErr w:type="spellStart"/>
-      <w:r>
-        <w:t>endpoints</w:t>
-      </w:r>
-      <w:proofErr w:type="spellEnd"/>
-      <w:r>
-        <w:t xml:space="preserve"> de conversión. </w:t>
+        <w:t xml:space="preserve">Control de acceso de los endpoints de conversión. </w:t>
       </w:r>
     </w:p>
     <w:p>
@@ -9958,10 +9923,9 @@
         <w:pStyle w:val="Ttulo1"/>
       </w:pPr>
       <w:bookmarkStart w:id="8" w:name="_t2y4v3m4kigp" w:colFirst="0" w:colLast="0"/>
-      <w:bookmarkStart w:id="9" w:name="_Toc243263140"/>
+      <w:bookmarkStart w:id="9" w:name="_Toc243458882"/>
       <w:bookmarkEnd w:id="8"/>
       <w:r>
-        <w:lastRenderedPageBreak/>
         <w:t xml:space="preserve">4. </w:t>
       </w:r>
       <w:r>
@@ -9974,7 +9938,7 @@
         <w:pStyle w:val="Ttulo2"/>
       </w:pPr>
       <w:bookmarkStart w:id="10" w:name="_v9fsu3t3r80c" w:colFirst="0" w:colLast="0"/>
-      <w:bookmarkStart w:id="11" w:name="_Toc243263141"/>
+      <w:bookmarkStart w:id="11" w:name="_Toc243458883"/>
       <w:bookmarkEnd w:id="10"/>
       <w:r>
         <w:t xml:space="preserve">4.1. </w:t>
@@ -9989,7 +9953,7 @@
         <w:pStyle w:val="Descripcin"/>
         <w:keepNext/>
       </w:pPr>
-      <w:bookmarkStart w:id="12" w:name="_Toc243263183"/>
+      <w:bookmarkStart w:id="12" w:name="_Toc243458925"/>
       <w:r>
         <w:t xml:space="preserve">Tabla </w:t>
       </w:r>
@@ -10334,14 +10298,12 @@
                 <w:color w:val="auto"/>
               </w:rPr>
             </w:pPr>
-            <w:proofErr w:type="spellStart"/>
             <w:r>
               <w:rPr>
                 <w:color w:val="auto"/>
               </w:rPr>
               <w:t>Endpoint</w:t>
             </w:r>
-            <w:proofErr w:type="spellEnd"/>
           </w:p>
         </w:tc>
         <w:tc>
@@ -10472,7 +10434,13 @@
               <w:rPr>
                 <w:color w:val="auto"/>
               </w:rPr>
-              <w:t>Magnitud que puede medirse. El catálogo contempla longitud, masa, volumen, tiempo, temperatura y área; solo longitud, masa y temperatura tienen conversiones implementadas.</w:t>
+              <w:t xml:space="preserve">Magnitud que puede medirse. </w:t>
+            </w:r>
+            <w:r>
+              <w:rPr>
+                <w:color w:val="auto"/>
+              </w:rPr>
+              <w:t>El catálogo contempla longitud, masa y temperatura; las tres tienen conversiones implementadas.</w:t>
             </w:r>
           </w:p>
         </w:tc>
@@ -10608,14 +10576,12 @@
             </w:pPr>
             <w:bookmarkStart w:id="17" w:name="_6gexsgbx4zq4" w:colFirst="0" w:colLast="0"/>
             <w:bookmarkEnd w:id="17"/>
-            <w:proofErr w:type="spellStart"/>
             <w:r>
               <w:rPr>
                 <w:color w:val="auto"/>
               </w:rPr>
               <w:t>Netbeans</w:t>
             </w:r>
-            <w:proofErr w:type="spellEnd"/>
           </w:p>
         </w:tc>
         <w:tc>
@@ -10702,7 +10668,7 @@
         <w:spacing w:before="240"/>
       </w:pPr>
       <w:bookmarkStart w:id="19" w:name="_hl9kzjvcxfou" w:colFirst="0" w:colLast="0"/>
-      <w:bookmarkStart w:id="20" w:name="_Toc243263142"/>
+      <w:bookmarkStart w:id="20" w:name="_Toc243458884"/>
       <w:bookmarkEnd w:id="19"/>
       <w:r>
         <w:t xml:space="preserve">4.2. </w:t>
@@ -10717,7 +10683,7 @@
         <w:pStyle w:val="Descripcin"/>
         <w:keepNext/>
       </w:pPr>
-      <w:bookmarkStart w:id="21" w:name="_Toc243263184"/>
+      <w:bookmarkStart w:id="21" w:name="_Toc243458926"/>
       <w:r>
         <w:t xml:space="preserve">Tabla </w:t>
       </w:r>
@@ -10877,21 +10843,7 @@
               <w:rPr>
                 <w:color w:val="auto"/>
               </w:rPr>
-              <w:t xml:space="preserve">Arquitectura Orientada a Servicios (Service-Oriented </w:t>
-            </w:r>
-            <w:proofErr w:type="spellStart"/>
-            <w:r>
-              <w:rPr>
-                <w:color w:val="auto"/>
-              </w:rPr>
-              <w:t>Architecture</w:t>
-            </w:r>
-            <w:proofErr w:type="spellEnd"/>
-            <w:r>
-              <w:rPr>
-                <w:color w:val="auto"/>
-              </w:rPr>
-              <w:t>).</w:t>
+              <w:t>Arquitectura Orientada a Servicios (Service-Oriented Architecture).</w:t>
             </w:r>
           </w:p>
         </w:tc>
@@ -10943,35 +10895,7 @@
               <w:rPr>
                 <w:color w:val="auto"/>
               </w:rPr>
-              <w:t xml:space="preserve">Protocolo Simple de Acceso a Objetos (Simple </w:t>
-            </w:r>
-            <w:proofErr w:type="spellStart"/>
-            <w:r>
-              <w:rPr>
-                <w:color w:val="auto"/>
-              </w:rPr>
-              <w:t>Object</w:t>
-            </w:r>
-            <w:proofErr w:type="spellEnd"/>
-            <w:r>
-              <w:rPr>
-                <w:color w:val="auto"/>
-              </w:rPr>
-              <w:t xml:space="preserve"> Access </w:t>
-            </w:r>
-            <w:proofErr w:type="spellStart"/>
-            <w:r>
-              <w:rPr>
-                <w:color w:val="auto"/>
-              </w:rPr>
-              <w:t>Protocol</w:t>
-            </w:r>
-            <w:proofErr w:type="spellEnd"/>
-            <w:r>
-              <w:rPr>
-                <w:color w:val="auto"/>
-              </w:rPr>
-              <w:t xml:space="preserve">). </w:t>
+              <w:t xml:space="preserve">Protocolo Simple de Acceso a Objetos (Simple Object Access Protocol). </w:t>
             </w:r>
           </w:p>
         </w:tc>
@@ -11053,7 +10977,6 @@
               <w:rPr>
                 <w:color w:val="auto"/>
               </w:rPr>
-              <w:lastRenderedPageBreak/>
               <w:t>XML</w:t>
             </w:r>
           </w:p>
@@ -11079,49 +11002,7 @@
               <w:rPr>
                 <w:color w:val="auto"/>
               </w:rPr>
-              <w:t>Lenguaje de Marcado Extensible (</w:t>
-            </w:r>
-            <w:proofErr w:type="spellStart"/>
-            <w:r>
-              <w:rPr>
-                <w:color w:val="auto"/>
-              </w:rPr>
-              <w:t>eXtensible</w:t>
-            </w:r>
-            <w:proofErr w:type="spellEnd"/>
-            <w:r>
-              <w:rPr>
-                <w:color w:val="auto"/>
-              </w:rPr>
-              <w:t xml:space="preserve"> </w:t>
-            </w:r>
-            <w:proofErr w:type="spellStart"/>
-            <w:r>
-              <w:rPr>
-                <w:color w:val="auto"/>
-              </w:rPr>
-              <w:t>Markup</w:t>
-            </w:r>
-            <w:proofErr w:type="spellEnd"/>
-            <w:r>
-              <w:rPr>
-                <w:color w:val="auto"/>
-              </w:rPr>
-              <w:t xml:space="preserve"> </w:t>
-            </w:r>
-            <w:proofErr w:type="spellStart"/>
-            <w:r>
-              <w:rPr>
-                <w:color w:val="auto"/>
-              </w:rPr>
-              <w:t>Language</w:t>
-            </w:r>
-            <w:proofErr w:type="spellEnd"/>
-            <w:r>
-              <w:rPr>
-                <w:color w:val="auto"/>
-              </w:rPr>
-              <w:t>).</w:t>
+              <w:t>Lenguaje de Marcado Extensible (eXtensible Markup Language).</w:t>
             </w:r>
           </w:p>
         </w:tc>
@@ -11176,35 +11057,7 @@
               <w:rPr>
                 <w:color w:val="auto"/>
               </w:rPr>
-              <w:t>Protocolo de Transferencia de Hipertexto (</w:t>
-            </w:r>
-            <w:proofErr w:type="spellStart"/>
-            <w:r>
-              <w:rPr>
-                <w:color w:val="auto"/>
-              </w:rPr>
-              <w:t>Hypertext</w:t>
-            </w:r>
-            <w:proofErr w:type="spellEnd"/>
-            <w:r>
-              <w:rPr>
-                <w:color w:val="auto"/>
-              </w:rPr>
-              <w:t xml:space="preserve"> Transfer </w:t>
-            </w:r>
-            <w:proofErr w:type="spellStart"/>
-            <w:r>
-              <w:rPr>
-                <w:color w:val="auto"/>
-              </w:rPr>
-              <w:t>Protocol</w:t>
-            </w:r>
-            <w:proofErr w:type="spellEnd"/>
-            <w:r>
-              <w:rPr>
-                <w:color w:val="auto"/>
-              </w:rPr>
-              <w:t xml:space="preserve">). </w:t>
+              <w:t xml:space="preserve">Protocolo de Transferencia de Hipertexto (Hypertext Transfer Protocol). </w:t>
             </w:r>
           </w:p>
         </w:tc>
@@ -11412,49 +11265,7 @@
               <w:rPr>
                 <w:color w:val="auto"/>
               </w:rPr>
-              <w:t xml:space="preserve">Web </w:t>
-            </w:r>
-            <w:proofErr w:type="spellStart"/>
-            <w:r>
-              <w:rPr>
-                <w:color w:val="auto"/>
-              </w:rPr>
-              <w:t>Services</w:t>
-            </w:r>
-            <w:proofErr w:type="spellEnd"/>
-            <w:r>
-              <w:rPr>
-                <w:color w:val="auto"/>
-              </w:rPr>
-              <w:t xml:space="preserve"> </w:t>
-            </w:r>
-            <w:proofErr w:type="spellStart"/>
-            <w:r>
-              <w:rPr>
-                <w:color w:val="auto"/>
-              </w:rPr>
-              <w:t>Description</w:t>
-            </w:r>
-            <w:proofErr w:type="spellEnd"/>
-            <w:r>
-              <w:rPr>
-                <w:color w:val="auto"/>
-              </w:rPr>
-              <w:t xml:space="preserve"> </w:t>
-            </w:r>
-            <w:proofErr w:type="spellStart"/>
-            <w:r>
-              <w:rPr>
-                <w:color w:val="auto"/>
-              </w:rPr>
-              <w:t>Language</w:t>
-            </w:r>
-            <w:proofErr w:type="spellEnd"/>
-            <w:r>
-              <w:rPr>
-                <w:color w:val="auto"/>
-              </w:rPr>
-              <w:t>: contrato de operaciones y mensajes del servicio SOAP.</w:t>
+              <w:t>Web Services Description Language: contrato de operaciones y mensajes del servicio SOAP.</w:t>
             </w:r>
           </w:p>
         </w:tc>
@@ -11466,7 +11277,7 @@
         <w:spacing w:before="240"/>
       </w:pPr>
       <w:bookmarkStart w:id="24" w:name="_rfbtvovuayiw" w:colFirst="0" w:colLast="0"/>
-      <w:bookmarkStart w:id="25" w:name="_Toc243263143"/>
+      <w:bookmarkStart w:id="25" w:name="_Toc243458885"/>
       <w:bookmarkEnd w:id="24"/>
       <w:r>
         <w:t xml:space="preserve">5. </w:t>
@@ -11481,7 +11292,7 @@
         <w:pStyle w:val="Descripcin"/>
         <w:keepNext/>
       </w:pPr>
-      <w:bookmarkStart w:id="26" w:name="_Toc243263185"/>
+      <w:bookmarkStart w:id="26" w:name="_Toc243458927"/>
       <w:r>
         <w:t xml:space="preserve">Tabla </w:t>
       </w:r>
@@ -11723,21 +11534,7 @@
               <w:rPr>
                 <w:color w:val="auto"/>
               </w:rPr>
-              <w:t xml:space="preserve">IEEE </w:t>
-            </w:r>
-            <w:proofErr w:type="spellStart"/>
-            <w:r>
-              <w:rPr>
-                <w:color w:val="auto"/>
-              </w:rPr>
-              <w:t>Std</w:t>
-            </w:r>
-            <w:proofErr w:type="spellEnd"/>
-            <w:r>
-              <w:rPr>
-                <w:color w:val="auto"/>
-              </w:rPr>
-              <w:t xml:space="preserve"> 830-1998 (plantilla académica de ERS)</w:t>
+              <w:t>IEEE Std 830-1998 (plantilla académica de ERS)</w:t>
             </w:r>
           </w:p>
         </w:tc>
@@ -11827,7 +11624,7 @@
         <w:spacing w:before="240"/>
       </w:pPr>
       <w:bookmarkStart w:id="27" w:name="_pxiho0865rt5" w:colFirst="0" w:colLast="0"/>
-      <w:bookmarkStart w:id="28" w:name="_Toc243263144"/>
+      <w:bookmarkStart w:id="28" w:name="_Toc243458886"/>
       <w:bookmarkEnd w:id="27"/>
       <w:r>
         <w:t xml:space="preserve">6. </w:t>
@@ -11856,7 +11653,7 @@
         <w:spacing w:before="0" w:after="0" w:line="240" w:lineRule="auto"/>
       </w:pPr>
       <w:bookmarkStart w:id="29" w:name="_8spj0to05lo4" w:colFirst="0" w:colLast="0"/>
-      <w:bookmarkStart w:id="30" w:name="_Toc243263145"/>
+      <w:bookmarkStart w:id="30" w:name="_Toc243458887"/>
       <w:bookmarkEnd w:id="29"/>
       <w:r>
         <w:t xml:space="preserve">7. </w:t>
@@ -11880,7 +11677,7 @@
         <w:spacing w:before="0" w:after="0"/>
       </w:pPr>
       <w:bookmarkStart w:id="31" w:name="_p0ttmoal4b5g" w:colFirst="0" w:colLast="0"/>
-      <w:bookmarkStart w:id="32" w:name="_Toc243263146"/>
+      <w:bookmarkStart w:id="32" w:name="_Toc243458888"/>
       <w:bookmarkEnd w:id="31"/>
       <w:r>
         <w:t xml:space="preserve">7.1. </w:t>
@@ -11904,7 +11701,7 @@
         <w:spacing w:before="0" w:after="0"/>
       </w:pPr>
       <w:bookmarkStart w:id="33" w:name="_2tt7ts6g2mqb" w:colFirst="0" w:colLast="0"/>
-      <w:bookmarkStart w:id="34" w:name="_Toc243263147"/>
+      <w:bookmarkStart w:id="34" w:name="_Toc243458889"/>
       <w:bookmarkEnd w:id="33"/>
       <w:r>
         <w:t xml:space="preserve">7.2. </w:t>
@@ -11976,7 +11773,13 @@
         <w:spacing w:before="0" w:after="0"/>
       </w:pPr>
       <w:r>
-        <w:t>Convertir longitud entre las unidades definidas en el catálogo: centímetros, metros, pies, yardas y millas.</w:t>
+        <w:t xml:space="preserve">Convertir longitud entre las unidades definidas en el catálogo: </w:t>
+      </w:r>
+      <w:r>
+        <w:t>kilómetros, metros, centímetros, milímetros, millas y pies</w:t>
+      </w:r>
+      <w:r>
+        <w:t>.</w:t>
       </w:r>
     </w:p>
     <w:p>
@@ -11995,11 +11798,13 @@
         <w:spacing w:before="0" w:after="0"/>
       </w:pPr>
       <w:r>
-        <w:t xml:space="preserve">Convertir masa entre las unidades definidas en el catálogo: gramos, kilogramos, onzas, libras y </w:t>
+        <w:t xml:space="preserve">Convertir masa entre las unidades definidas en el catálogo: </w:t>
       </w:r>
       <w:r>
-        <w:lastRenderedPageBreak/>
-        <w:t>quintales.</w:t>
+        <w:t>kilogramos, gramos, miligramos y libras</w:t>
+      </w:r>
+      <w:r>
+        <w:t>.</w:t>
       </w:r>
     </w:p>
     <w:p>
@@ -12018,7 +11823,13 @@
         <w:spacing w:before="0" w:after="0"/>
       </w:pPr>
       <w:r>
-        <w:t>Convertir temperatura entre Celsius, Fahrenheit, Kelvin, Newton y Réaumur mediante fórmulas adecuadas.</w:t>
+        <w:t xml:space="preserve">Convertir temperatura entre </w:t>
+      </w:r>
+      <w:r>
+        <w:t>Celsius, Fahrenheit y Kelvin</w:t>
+      </w:r>
+      <w:r>
+        <w:t xml:space="preserve"> mediante fórmulas adecuadas.</w:t>
       </w:r>
     </w:p>
     <w:p>
@@ -12100,7 +11911,7 @@
                     <pic:cNvPicPr preferRelativeResize="0"/>
                   </pic:nvPicPr>
                   <pic:blipFill>
-                    <a:blip r:embed="rId16"/>
+                    <a:blip r:embed="rId11"/>
                     <a:srcRect/>
                     <a:stretch>
                       <a:fillRect/>
@@ -12127,7 +11938,7 @@
       <w:pPr>
         <w:pStyle w:val="Descripcin"/>
       </w:pPr>
-      <w:bookmarkStart w:id="36" w:name="_Toc243263182"/>
+      <w:bookmarkStart w:id="36" w:name="_Toc243458924"/>
       <w:r>
         <w:t xml:space="preserve">Ilustración </w:t>
       </w:r>
@@ -12161,47 +11972,7 @@
           <w:sz w:val="16"/>
           <w:szCs w:val="16"/>
         </w:rPr>
-        <w:t>: CU-16 «</w:t>
-      </w:r>
-      <w:proofErr w:type="spellStart"/>
-      <w:r>
-        <w:rPr>
-          <w:i/>
-          <w:iCs/>
-          <w:sz w:val="16"/>
-          <w:szCs w:val="16"/>
-        </w:rPr>
-        <w:t>extend</w:t>
-      </w:r>
-      <w:proofErr w:type="spellEnd"/>
-      <w:r>
-        <w:rPr>
-          <w:i/>
-          <w:iCs/>
-          <w:sz w:val="16"/>
-          <w:szCs w:val="16"/>
-        </w:rPr>
-        <w:t>» CU-01 (error de autenticación) y CU-17 «</w:t>
-      </w:r>
-      <w:proofErr w:type="spellStart"/>
-      <w:r>
-        <w:rPr>
-          <w:i/>
-          <w:iCs/>
-          <w:sz w:val="16"/>
-          <w:szCs w:val="16"/>
-        </w:rPr>
-        <w:t>extend</w:t>
-      </w:r>
-      <w:proofErr w:type="spellEnd"/>
-      <w:r>
-        <w:rPr>
-          <w:i/>
-          <w:iCs/>
-          <w:sz w:val="16"/>
-          <w:szCs w:val="16"/>
-        </w:rPr>
-        <w:t xml:space="preserve">» CU-07 (sesión expirada). </w:t>
+        <w:t xml:space="preserve">: CU-16 «extend» CU-01 (error de autenticación) y CU-17 «extend» CU-07 (sesión expirada). </w:t>
       </w:r>
       <w:r>
         <w:rPr>
@@ -12234,10 +12005,9 @@
         <w:spacing w:before="0" w:after="0"/>
       </w:pPr>
       <w:bookmarkStart w:id="38" w:name="_rdwsgx58dyh9" w:colFirst="0" w:colLast="0"/>
-      <w:bookmarkStart w:id="39" w:name="_Toc243263148"/>
+      <w:bookmarkStart w:id="39" w:name="_Toc243458890"/>
       <w:bookmarkEnd w:id="38"/>
       <w:r>
-        <w:lastRenderedPageBreak/>
         <w:t xml:space="preserve">7.3. </w:t>
       </w:r>
       <w:r>
@@ -12328,15 +12098,7 @@
         <w:spacing w:before="0" w:after="0"/>
       </w:pPr>
       <w:r>
-        <w:t xml:space="preserve">El servidor funciona sobre un entorno Java capaz de publicar </w:t>
-      </w:r>
-      <w:proofErr w:type="spellStart"/>
-      <w:r>
-        <w:t>endpoints</w:t>
-      </w:r>
-      <w:proofErr w:type="spellEnd"/>
-      <w:r>
-        <w:t xml:space="preserve"> SOAP/JAX-WS en red. Los clientes previstos son consola, escritorio Java Swing, navegador web y Android. La red debe permitir que las peticiones y respuestas XML viajen sin problema entre cliente y servidor.</w:t>
+        <w:t>El servidor funciona sobre un entorno Java capaz de publicar endpoints SOAP/JAX-WS en red. Los clientes previstos son consola, escritorio Java Swing, navegador web y Android. La red debe permitir que las peticiones y respuestas XML viajen sin problema entre cliente y servidor.</w:t>
       </w:r>
     </w:p>
     <w:p>
@@ -12350,7 +12112,7 @@
         <w:spacing w:before="0" w:after="0"/>
       </w:pPr>
       <w:bookmarkStart w:id="40" w:name="_bn2sdtovxifb" w:colFirst="0" w:colLast="0"/>
-      <w:bookmarkStart w:id="41" w:name="_Toc243263149"/>
+      <w:bookmarkStart w:id="41" w:name="_Toc243458891"/>
       <w:bookmarkEnd w:id="40"/>
       <w:r>
         <w:t xml:space="preserve">7.4. </w:t>
@@ -12378,7 +12140,7 @@
         <w:pStyle w:val="Descripcin"/>
         <w:keepNext/>
       </w:pPr>
-      <w:bookmarkStart w:id="42" w:name="_Toc243263186"/>
+      <w:bookmarkStart w:id="42" w:name="_Toc243458928"/>
       <w:r>
         <w:t xml:space="preserve">Tabla </w:t>
       </w:r>
@@ -12657,7 +12419,7 @@
         <w:spacing w:before="240" w:after="0"/>
       </w:pPr>
       <w:bookmarkStart w:id="43" w:name="_ak1zxoq6fwhb" w:colFirst="0" w:colLast="0"/>
-      <w:bookmarkStart w:id="44" w:name="_Toc243263150"/>
+      <w:bookmarkStart w:id="44" w:name="_Toc243458892"/>
       <w:bookmarkEnd w:id="43"/>
       <w:r>
         <w:t xml:space="preserve">7.5. </w:t>
@@ -12684,7 +12446,7 @@
         <w:pStyle w:val="Ttulo2"/>
         <w:spacing w:before="0" w:after="0"/>
       </w:pPr>
-      <w:bookmarkStart w:id="46" w:name="_Toc243263151"/>
+      <w:bookmarkStart w:id="46" w:name="_Toc243458893"/>
       <w:r>
         <w:t xml:space="preserve">7.6. </w:t>
       </w:r>
@@ -12750,15 +12512,7 @@
         <w:spacing w:before="0" w:after="0"/>
       </w:pPr>
       <w:r>
-        <w:t xml:space="preserve">Los casos de uso se modelan en </w:t>
-      </w:r>
-      <w:proofErr w:type="spellStart"/>
-      <w:r>
-        <w:t>PowerDesigner</w:t>
-      </w:r>
-      <w:proofErr w:type="spellEnd"/>
-      <w:r>
-        <w:t>; usar esta herramienta no implica que el sistema tenga base de datos.</w:t>
+        <w:t>Los casos de uso se modelan en PowerDesigner; usar esta herramienta no implica que el sistema tenga base de datos.</w:t>
       </w:r>
     </w:p>
     <w:p>
@@ -12896,7 +12650,7 @@
         <w:spacing w:before="0" w:after="0"/>
       </w:pPr>
       <w:bookmarkStart w:id="47" w:name="_1olm20nv8l8r" w:colFirst="0" w:colLast="0"/>
-      <w:bookmarkStart w:id="48" w:name="_Toc243263152"/>
+      <w:bookmarkStart w:id="48" w:name="_Toc243458894"/>
       <w:bookmarkEnd w:id="47"/>
       <w:r>
         <w:t xml:space="preserve">7.7. </w:t>
@@ -12911,15 +12665,7 @@
         <w:spacing w:before="0" w:after="0"/>
       </w:pPr>
       <w:r>
-        <w:t xml:space="preserve">El sistema depende de la disponibilidad del servidor SOAP, de la red y de la configuración de credenciales y unidades en el </w:t>
-      </w:r>
-      <w:proofErr w:type="spellStart"/>
-      <w:r>
-        <w:t>backend</w:t>
-      </w:r>
-      <w:proofErr w:type="spellEnd"/>
-      <w:r>
-        <w:t>.</w:t>
+        <w:t>El sistema depende de la disponibilidad del servidor SOAP, de la red y de la configuración de credenciales y unidades en el backend.</w:t>
       </w:r>
     </w:p>
     <w:p>
@@ -12938,15 +12684,7 @@
         <w:spacing w:before="0" w:after="0"/>
       </w:pPr>
       <w:r>
-        <w:t xml:space="preserve">La ejecución de cada cliente depende de disponer del </w:t>
-      </w:r>
-      <w:proofErr w:type="spellStart"/>
-      <w:r>
-        <w:t>runtime</w:t>
-      </w:r>
-      <w:proofErr w:type="spellEnd"/>
-      <w:r>
-        <w:t xml:space="preserve"> o plataforma adecuada y acceso de red al servicio.</w:t>
+        <w:t>La ejecución de cada cliente depende de disponer del runtime o plataforma adecuada y acceso de red al servicio.</w:t>
       </w:r>
     </w:p>
     <w:p>
@@ -12965,11 +12703,7 @@
         <w:spacing w:before="0" w:after="0"/>
       </w:pPr>
       <w:r>
-        <w:t xml:space="preserve">El catálogo y las credenciales están preconfigurados, dado que el sistema no incluye operaciones </w:t>
-      </w:r>
-      <w:r>
-        <w:lastRenderedPageBreak/>
-        <w:t>de registro ni una base de datos.</w:t>
+        <w:t>El catálogo y las credenciales están preconfigurados, dado que el sistema no incluye operaciones de registro ni una base de datos.</w:t>
       </w:r>
     </w:p>
     <w:p>
@@ -12998,7 +12732,7 @@
         <w:pStyle w:val="Ttulo1"/>
       </w:pPr>
       <w:bookmarkStart w:id="49" w:name="_m0ubqwpvql6i" w:colFirst="0" w:colLast="0"/>
-      <w:bookmarkStart w:id="50" w:name="_Toc243263153"/>
+      <w:bookmarkStart w:id="50" w:name="_Toc243458895"/>
       <w:bookmarkEnd w:id="49"/>
       <w:r>
         <w:t xml:space="preserve">8. </w:t>
@@ -13013,7 +12747,7 @@
         <w:pStyle w:val="Ttulo2"/>
       </w:pPr>
       <w:bookmarkStart w:id="51" w:name="_50b70xaiezr1" w:colFirst="0" w:colLast="0"/>
-      <w:bookmarkStart w:id="52" w:name="_Toc243263154"/>
+      <w:bookmarkStart w:id="52" w:name="_Toc243458896"/>
       <w:bookmarkEnd w:id="51"/>
       <w:r>
         <w:t xml:space="preserve">8.1. </w:t>
@@ -13028,7 +12762,7 @@
         <w:pStyle w:val="Ttulo3"/>
       </w:pPr>
       <w:bookmarkStart w:id="53" w:name="_elrq7rre80v0" w:colFirst="0" w:colLast="0"/>
-      <w:bookmarkStart w:id="54" w:name="_Toc243263155"/>
+      <w:bookmarkStart w:id="54" w:name="_Toc243458897"/>
       <w:bookmarkEnd w:id="53"/>
       <w:r>
         <w:t xml:space="preserve">8.1.1. </w:t>
@@ -13048,7 +12782,7 @@
         <w:pStyle w:val="Ttulo3"/>
       </w:pPr>
       <w:bookmarkStart w:id="55" w:name="_69tc3u1p4u0y" w:colFirst="0" w:colLast="0"/>
-      <w:bookmarkStart w:id="56" w:name="_Toc243263156"/>
+      <w:bookmarkStart w:id="56" w:name="_Toc243458898"/>
       <w:bookmarkEnd w:id="55"/>
       <w:r>
         <w:t xml:space="preserve">8.1.2. </w:t>
@@ -13063,7 +12797,7 @@
         <w:pStyle w:val="Descripcin"/>
         <w:keepNext/>
       </w:pPr>
-      <w:bookmarkStart w:id="57" w:name="_Toc243263187"/>
+      <w:bookmarkStart w:id="57" w:name="_Toc243458929"/>
       <w:r>
         <w:t xml:space="preserve">Tabla </w:t>
       </w:r>
@@ -13420,16 +13154,8 @@
               <w:rPr>
                 <w:color w:val="auto"/>
               </w:rPr>
-              <w:t xml:space="preserve">Navegador y conectividad con </w:t>
-            </w:r>
-            <w:proofErr w:type="spellStart"/>
-            <w:r>
-              <w:rPr>
-                <w:color w:val="auto"/>
-              </w:rPr>
-              <w:t>backend</w:t>
-            </w:r>
-            <w:proofErr w:type="spellEnd"/>
+              <w:t>Navegador y conectividad con backend</w:t>
+            </w:r>
           </w:p>
         </w:tc>
         <w:tc>
@@ -13537,7 +13263,7 @@
         <w:spacing w:before="240"/>
       </w:pPr>
       <w:bookmarkStart w:id="58" w:name="_8sc7bnm86r2r" w:colFirst="0" w:colLast="0"/>
-      <w:bookmarkStart w:id="59" w:name="_Toc243263157"/>
+      <w:bookmarkStart w:id="59" w:name="_Toc243458899"/>
       <w:bookmarkEnd w:id="58"/>
       <w:r>
         <w:t xml:space="preserve">8.1.3. </w:t>
@@ -13552,9 +13278,8 @@
         <w:pStyle w:val="Descripcin"/>
         <w:keepNext/>
       </w:pPr>
-      <w:bookmarkStart w:id="60" w:name="_Toc243263188"/>
+      <w:bookmarkStart w:id="60" w:name="_Toc243458930"/>
       <w:r>
-        <w:lastRenderedPageBreak/>
         <w:t xml:space="preserve">Tabla </w:t>
       </w:r>
       <w:fldSimple w:instr=" SEQ Tabla \* ARABIC ">
@@ -13992,16 +13717,8 @@
               <w:rPr>
                 <w:color w:val="auto"/>
               </w:rPr>
-              <w:t xml:space="preserve">SAP </w:t>
-            </w:r>
-            <w:proofErr w:type="spellStart"/>
-            <w:r>
-              <w:rPr>
-                <w:color w:val="auto"/>
-              </w:rPr>
-              <w:t>PowerDesigner</w:t>
-            </w:r>
-            <w:proofErr w:type="spellEnd"/>
+              <w:t>SAP PowerDesigner</w:t>
+            </w:r>
           </w:p>
         </w:tc>
         <w:tc>
@@ -14052,35 +13769,7 @@
               <w:rPr>
                 <w:color w:val="auto"/>
               </w:rPr>
-              <w:t xml:space="preserve">Modelar actor, casos de uso y relaciones </w:t>
-            </w:r>
-            <w:proofErr w:type="spellStart"/>
-            <w:r>
-              <w:rPr>
-                <w:color w:val="auto"/>
-              </w:rPr>
-              <w:t>include</w:t>
-            </w:r>
-            <w:proofErr w:type="spellEnd"/>
-            <w:r>
-              <w:rPr>
-                <w:color w:val="auto"/>
-              </w:rPr>
-              <w:t>/</w:t>
-            </w:r>
-            <w:proofErr w:type="spellStart"/>
-            <w:r>
-              <w:rPr>
-                <w:color w:val="auto"/>
-              </w:rPr>
-              <w:t>extend</w:t>
-            </w:r>
-            <w:proofErr w:type="spellEnd"/>
-            <w:r>
-              <w:rPr>
-                <w:color w:val="auto"/>
-              </w:rPr>
-              <w:t>/generalización.</w:t>
+              <w:t>Modelar actor, casos de uso y relaciones include/extend/generalización.</w:t>
             </w:r>
           </w:p>
         </w:tc>
@@ -14137,21 +13826,7 @@
               <w:rPr>
                 <w:color w:val="auto"/>
               </w:rPr>
-              <w:t xml:space="preserve">Java / JAX-WS (compatible con el </w:t>
-            </w:r>
-            <w:proofErr w:type="spellStart"/>
-            <w:r>
-              <w:rPr>
-                <w:color w:val="auto"/>
-              </w:rPr>
-              <w:t>runtime</w:t>
-            </w:r>
-            <w:proofErr w:type="spellEnd"/>
-            <w:r>
-              <w:rPr>
-                <w:color w:val="auto"/>
-              </w:rPr>
-              <w:t>)</w:t>
+              <w:t>Java / JAX-WS (compatible con el runtime)</w:t>
             </w:r>
           </w:p>
         </w:tc>
@@ -14297,21 +13972,7 @@
               <w:rPr>
                 <w:color w:val="auto"/>
               </w:rPr>
-              <w:t xml:space="preserve">Exponer los </w:t>
-            </w:r>
-            <w:proofErr w:type="spellStart"/>
-            <w:r>
-              <w:rPr>
-                <w:color w:val="auto"/>
-              </w:rPr>
-              <w:t>endpoints</w:t>
-            </w:r>
-            <w:proofErr w:type="spellEnd"/>
-            <w:r>
-              <w:rPr>
-                <w:color w:val="auto"/>
-              </w:rPr>
-              <w:t xml:space="preserve"> SOAP usados por los cuatro clientes.</w:t>
+              <w:t>Exponer los endpoints SOAP usados por los cuatro clientes.</w:t>
             </w:r>
           </w:p>
         </w:tc>
@@ -14323,7 +13984,7 @@
         <w:spacing w:before="240"/>
       </w:pPr>
       <w:bookmarkStart w:id="61" w:name="_7zo2fz6o1msu" w:colFirst="0" w:colLast="0"/>
-      <w:bookmarkStart w:id="62" w:name="_Toc243263158"/>
+      <w:bookmarkStart w:id="62" w:name="_Toc243458900"/>
       <w:bookmarkEnd w:id="61"/>
       <w:r>
         <w:t xml:space="preserve">8.1.4. </w:t>
@@ -14379,7 +14040,7 @@
         <w:pStyle w:val="Ttulo2"/>
       </w:pPr>
       <w:bookmarkStart w:id="63" w:name="_fhy5jisp1765" w:colFirst="0" w:colLast="0"/>
-      <w:bookmarkStart w:id="64" w:name="_Toc243263159"/>
+      <w:bookmarkStart w:id="64" w:name="_Toc243458901"/>
       <w:bookmarkEnd w:id="63"/>
       <w:r>
         <w:t xml:space="preserve">8.2. </w:t>
@@ -14394,7 +14055,7 @@
         <w:pStyle w:val="Ttulo3"/>
       </w:pPr>
       <w:bookmarkStart w:id="65" w:name="_r17p6hd3opju" w:colFirst="0" w:colLast="0"/>
-      <w:bookmarkStart w:id="66" w:name="_Toc243263160"/>
+      <w:bookmarkStart w:id="66" w:name="_Toc243458902"/>
       <w:bookmarkEnd w:id="65"/>
       <w:r>
         <w:t xml:space="preserve">8.2.1. </w:t>
@@ -14413,7 +14074,7 @@
       <w:pPr>
         <w:pStyle w:val="Ttulo3"/>
       </w:pPr>
-      <w:bookmarkStart w:id="67" w:name="_Toc243263161"/>
+      <w:bookmarkStart w:id="67" w:name="_Toc243458903"/>
       <w:r>
         <w:t xml:space="preserve">8.2.2. </w:t>
       </w:r>
@@ -14432,9 +14093,8 @@
         <w:pStyle w:val="Descripcin"/>
         <w:keepNext/>
       </w:pPr>
-      <w:bookmarkStart w:id="68" w:name="_Toc243263189"/>
+      <w:bookmarkStart w:id="68" w:name="_Toc243458931"/>
       <w:r>
-        <w:lastRenderedPageBreak/>
         <w:t xml:space="preserve">Tabla </w:t>
       </w:r>
       <w:fldSimple w:instr=" SEQ Tabla \* ARABIC ">
@@ -14712,7 +14372,7 @@
         <w:keepNext/>
         <w:spacing w:before="240"/>
       </w:pPr>
-      <w:bookmarkStart w:id="69" w:name="_Toc243263190"/>
+      <w:bookmarkStart w:id="69" w:name="_Toc243458932"/>
       <w:r>
         <w:t xml:space="preserve">Tabla </w:t>
       </w:r>
@@ -14991,7 +14651,7 @@
         <w:keepNext/>
         <w:spacing w:before="240"/>
       </w:pPr>
-      <w:bookmarkStart w:id="70" w:name="_Toc243263191"/>
+      <w:bookmarkStart w:id="70" w:name="_Toc243458933"/>
       <w:r>
         <w:t xml:space="preserve">Tabla </w:t>
       </w:r>
@@ -15270,7 +14930,7 @@
         <w:spacing w:before="240"/>
       </w:pPr>
       <w:bookmarkStart w:id="71" w:name="_ly32sriwu0x0" w:colFirst="0" w:colLast="0"/>
-      <w:bookmarkStart w:id="72" w:name="_Toc243263162"/>
+      <w:bookmarkStart w:id="72" w:name="_Toc243458904"/>
       <w:bookmarkEnd w:id="71"/>
       <w:r>
         <w:t xml:space="preserve">8.2.3. </w:t>
@@ -15285,7 +14945,7 @@
         <w:pStyle w:val="Descripcin"/>
         <w:keepNext/>
       </w:pPr>
-      <w:bookmarkStart w:id="73" w:name="_Toc243263192"/>
+      <w:bookmarkStart w:id="73" w:name="_Toc243458934"/>
       <w:r>
         <w:t xml:space="preserve">Tabla </w:t>
       </w:r>
@@ -15537,7 +15197,7 @@
         <w:spacing w:before="240"/>
       </w:pPr>
       <w:bookmarkStart w:id="74" w:name="_cxmp8xoi2x07" w:colFirst="0" w:colLast="0"/>
-      <w:bookmarkStart w:id="75" w:name="_Toc243263163"/>
+      <w:bookmarkStart w:id="75" w:name="_Toc243458905"/>
       <w:bookmarkEnd w:id="74"/>
       <w:r>
         <w:t xml:space="preserve">8.2.4. </w:t>
@@ -15557,9 +15217,8 @@
         <w:pStyle w:val="Descripcin"/>
         <w:keepNext/>
       </w:pPr>
-      <w:bookmarkStart w:id="76" w:name="_Toc243263193"/>
+      <w:bookmarkStart w:id="76" w:name="_Toc243458935"/>
       <w:r>
-        <w:lastRenderedPageBreak/>
         <w:t xml:space="preserve">Tabla </w:t>
       </w:r>
       <w:fldSimple w:instr=" SEQ Tabla \* ARABIC ">
@@ -17480,7 +17139,7 @@
         <w:spacing w:before="240"/>
       </w:pPr>
       <w:bookmarkStart w:id="77" w:name="_xhldoqbny7ol" w:colFirst="0" w:colLast="0"/>
-      <w:bookmarkStart w:id="78" w:name="_Toc243263164"/>
+      <w:bookmarkStart w:id="78" w:name="_Toc243458906"/>
       <w:bookmarkEnd w:id="77"/>
       <w:r>
         <w:t xml:space="preserve">8.2.5. </w:t>
@@ -17492,15 +17151,7 @@
     </w:p>
     <w:p>
       <w:r>
-        <w:t xml:space="preserve">A </w:t>
-      </w:r>
-      <w:proofErr w:type="gramStart"/>
-      <w:r>
-        <w:t>continuación</w:t>
-      </w:r>
-      <w:proofErr w:type="gramEnd"/>
-      <w:r>
-        <w:t xml:space="preserve"> se describen los requisitos RQF-001 a RQF-017. Cubren los 15 casos del diagrama base y las extensiones CU-16 y CU-17 (error de autenticación y sesión expirada) que pide el taller.</w:t>
+        <w:t>A continuación se describen los requisitos RQF-001 a RQF-017. Cubren los 15 casos del diagrama base y las extensiones CU-16 y CU-17 (error de autenticación y sesión expirada) que pide el taller.</w:t>
       </w:r>
     </w:p>
     <w:p>
@@ -17508,9 +17159,8 @@
         <w:pStyle w:val="Descripcin"/>
         <w:keepNext/>
       </w:pPr>
-      <w:bookmarkStart w:id="79" w:name="_Toc243263194"/>
+      <w:bookmarkStart w:id="79" w:name="_Toc243458936"/>
       <w:r>
-        <w:lastRenderedPageBreak/>
         <w:t xml:space="preserve">Tabla </w:t>
       </w:r>
       <w:fldSimple w:instr=" SEQ Tabla \* ARABIC ">
@@ -17960,7 +17610,7 @@
         <w:keepNext/>
         <w:spacing w:before="240"/>
       </w:pPr>
-      <w:bookmarkStart w:id="80" w:name="_Toc243263195"/>
+      <w:bookmarkStart w:id="80" w:name="_Toc243458937"/>
       <w:r>
         <w:t xml:space="preserve">Tabla </w:t>
       </w:r>
@@ -18121,7 +17771,19 @@
               <w:rPr>
                 <w:color w:val="auto"/>
               </w:rPr>
-              <w:t>El servicio convertirá longitud entre centímetros, metros, pies, yardas y millas mediante factores coherentes con una unidad base.</w:t>
+              <w:t xml:space="preserve">El servicio convertirá longitud entre </w:t>
+            </w:r>
+            <w:r>
+              <w:rPr>
+                <w:color w:val="auto"/>
+              </w:rPr>
+              <w:t>kilómetros, metros, centímetros, milímetros, millas y pies</w:t>
+            </w:r>
+            <w:r>
+              <w:rPr>
+                <w:color w:val="auto"/>
+              </w:rPr>
+              <w:t xml:space="preserve"> mediante factores coherentes con una unidad base.</w:t>
             </w:r>
           </w:p>
         </w:tc>
@@ -18420,7 +18082,7 @@
         <w:keepNext/>
         <w:spacing w:before="240"/>
       </w:pPr>
-      <w:bookmarkStart w:id="81" w:name="_Toc243263196"/>
+      <w:bookmarkStart w:id="81" w:name="_Toc243458938"/>
       <w:r>
         <w:t xml:space="preserve">Tabla </w:t>
       </w:r>
@@ -18581,7 +18243,19 @@
               <w:rPr>
                 <w:color w:val="auto"/>
               </w:rPr>
-              <w:t>El servicio convertirá masa entre gramos, kilogramos, onzas, libras y quintales mediante factores coherentes con una unidad base.</w:t>
+              <w:t xml:space="preserve">El servicio convertirá masa entre </w:t>
+            </w:r>
+            <w:r>
+              <w:rPr>
+                <w:color w:val="auto"/>
+              </w:rPr>
+              <w:t>kilogramos, gramos, miligramos y libras</w:t>
+            </w:r>
+            <w:r>
+              <w:rPr>
+                <w:color w:val="auto"/>
+              </w:rPr>
+              <w:t xml:space="preserve"> mediante factores coherentes con una unidad base.</w:t>
             </w:r>
           </w:p>
         </w:tc>
@@ -18880,9 +18554,8 @@
         <w:keepNext/>
         <w:spacing w:before="240"/>
       </w:pPr>
-      <w:bookmarkStart w:id="82" w:name="_Toc243263197"/>
+      <w:bookmarkStart w:id="82" w:name="_Toc243458939"/>
       <w:r>
-        <w:lastRenderedPageBreak/>
         <w:t xml:space="preserve">Tabla </w:t>
       </w:r>
       <w:fldSimple w:instr=" SEQ Tabla \* ARABIC ">
@@ -19042,7 +18715,19 @@
               <w:rPr>
                 <w:color w:val="auto"/>
               </w:rPr>
-              <w:t>El servicio convertirá temperatura entre Celsius, Fahrenheit, Kelvin, Newton y Réaumur mediante fórmulas de escalas.</w:t>
+              <w:t xml:space="preserve">El servicio convertirá temperatura entre </w:t>
+            </w:r>
+            <w:r>
+              <w:rPr>
+                <w:color w:val="auto"/>
+              </w:rPr>
+              <w:t>Celsius, Fahrenheit y Kelvin</w:t>
+            </w:r>
+            <w:r>
+              <w:rPr>
+                <w:color w:val="auto"/>
+              </w:rPr>
+              <w:t xml:space="preserve"> mediante fórmulas de escalas.</w:t>
             </w:r>
           </w:p>
         </w:tc>
@@ -19341,7 +19026,7 @@
         <w:keepNext/>
         <w:spacing w:before="240"/>
       </w:pPr>
-      <w:bookmarkStart w:id="83" w:name="_Toc243263198"/>
+      <w:bookmarkStart w:id="83" w:name="_Toc243458940"/>
       <w:r>
         <w:t xml:space="preserve">Tabla </w:t>
       </w:r>
@@ -19501,7 +19186,7 @@
               <w:rPr>
                 <w:color w:val="auto"/>
               </w:rPr>
-              <w:t>El servicio debe devolver las categorías del catálogo (longitud, masa, volumen, tiempo, temperatura y área). La implementación de conversión se limita a longitud, masa y temperatura.</w:t>
+              <w:t>El servicio debe devolver las categorías del catálogo: longitud, masa y temperatura, todas con conversión implementada.</w:t>
             </w:r>
           </w:p>
         </w:tc>
@@ -19792,7 +19477,7 @@
         <w:keepNext/>
         <w:spacing w:before="240"/>
       </w:pPr>
-      <w:bookmarkStart w:id="84" w:name="_Toc243263199"/>
+      <w:bookmarkStart w:id="84" w:name="_Toc243458941"/>
       <w:r>
         <w:t xml:space="preserve">Tabla </w:t>
       </w:r>
@@ -20243,9 +19928,8 @@
         <w:keepNext/>
         <w:spacing w:before="240"/>
       </w:pPr>
-      <w:bookmarkStart w:id="85" w:name="_Toc243263200"/>
+      <w:bookmarkStart w:id="85" w:name="_Toc243458942"/>
       <w:r>
-        <w:lastRenderedPageBreak/>
         <w:t xml:space="preserve">Tabla </w:t>
       </w:r>
       <w:fldSimple w:instr=" SEQ Tabla \* ARABIC ">
@@ -20695,7 +20379,7 @@
         <w:keepNext/>
         <w:spacing w:before="240"/>
       </w:pPr>
-      <w:bookmarkStart w:id="86" w:name="_Toc243263201"/>
+      <w:bookmarkStart w:id="86" w:name="_Toc243458943"/>
       <w:r>
         <w:t xml:space="preserve">Tabla </w:t>
       </w:r>
@@ -21146,7 +20830,7 @@
         <w:keepNext/>
         <w:spacing w:before="240"/>
       </w:pPr>
-      <w:bookmarkStart w:id="87" w:name="_Toc243263202"/>
+      <w:bookmarkStart w:id="87" w:name="_Toc243458944"/>
       <w:r>
         <w:t xml:space="preserve">Tabla </w:t>
       </w:r>
@@ -21597,9 +21281,8 @@
         <w:keepNext/>
         <w:spacing w:before="240"/>
       </w:pPr>
-      <w:bookmarkStart w:id="88" w:name="_Toc243263203"/>
+      <w:bookmarkStart w:id="88" w:name="_Toc243458945"/>
       <w:r>
-        <w:lastRenderedPageBreak/>
         <w:t xml:space="preserve">Tabla </w:t>
       </w:r>
       <w:fldSimple w:instr=" SEQ Tabla \* ARABIC ">
@@ -22049,7 +21732,7 @@
         <w:keepNext/>
         <w:spacing w:before="240"/>
       </w:pPr>
-      <w:bookmarkStart w:id="89" w:name="_Toc243263204"/>
+      <w:bookmarkStart w:id="89" w:name="_Toc243458946"/>
       <w:r>
         <w:t xml:space="preserve">Tabla </w:t>
       </w:r>
@@ -22500,7 +22183,7 @@
         <w:keepNext/>
         <w:spacing w:before="240"/>
       </w:pPr>
-      <w:bookmarkStart w:id="90" w:name="_Toc243263205"/>
+      <w:bookmarkStart w:id="90" w:name="_Toc243458947"/>
       <w:r>
         <w:t xml:space="preserve">Tabla </w:t>
       </w:r>
@@ -22951,9 +22634,8 @@
         <w:keepNext/>
         <w:spacing w:before="240"/>
       </w:pPr>
-      <w:bookmarkStart w:id="91" w:name="_Toc243263206"/>
+      <w:bookmarkStart w:id="91" w:name="_Toc243458948"/>
       <w:r>
-        <w:lastRenderedPageBreak/>
         <w:t xml:space="preserve">Tabla </w:t>
       </w:r>
       <w:fldSimple w:instr=" SEQ Tabla \* ARABIC ">
@@ -23403,7 +23085,7 @@
         <w:keepNext/>
         <w:spacing w:before="240"/>
       </w:pPr>
-      <w:bookmarkStart w:id="92" w:name="_Toc243263207"/>
+      <w:bookmarkStart w:id="92" w:name="_Toc243458949"/>
       <w:r>
         <w:t xml:space="preserve">Tabla </w:t>
       </w:r>
@@ -23842,21 +23524,7 @@
               <w:rPr>
                 <w:color w:val="auto"/>
               </w:rPr>
-              <w:t>Trazabilidad: RQF-014 ↔ CU-16 Gestionar error de autenticación; «</w:t>
-            </w:r>
-            <w:proofErr w:type="spellStart"/>
-            <w:r>
-              <w:rPr>
-                <w:color w:val="auto"/>
-              </w:rPr>
-              <w:t>extend</w:t>
-            </w:r>
-            <w:proofErr w:type="spellEnd"/>
-            <w:r>
-              <w:rPr>
-                <w:color w:val="auto"/>
-              </w:rPr>
-              <w:t>» hacia CU-01 Autenticarse en el sistema, condicionado a credenciales inválidas.</w:t>
+              <w:t>Trazabilidad: RQF-014 ↔ CU-16 Gestionar error de autenticación; «extend» hacia CU-01 Autenticarse en el sistema, condicionado a credenciales inválidas.</w:t>
             </w:r>
           </w:p>
         </w:tc>
@@ -23867,7 +23535,7 @@
         <w:pStyle w:val="Ttulo3"/>
         <w:spacing w:before="240"/>
       </w:pPr>
-      <w:bookmarkStart w:id="93" w:name="_Toc243263165"/>
+      <w:bookmarkStart w:id="93" w:name="_Toc243458907"/>
       <w:r>
         <w:t xml:space="preserve">8.2.6. </w:t>
       </w:r>
@@ -23886,7 +23554,7 @@
         <w:pStyle w:val="Descripcin"/>
         <w:keepNext/>
       </w:pPr>
-      <w:bookmarkStart w:id="94" w:name="_Toc243263208"/>
+      <w:bookmarkStart w:id="94" w:name="_Toc243458950"/>
       <w:r>
         <w:t xml:space="preserve">Tabla </w:t>
       </w:r>
@@ -24072,21 +23740,7 @@
               <w:rPr>
                 <w:color w:val="auto"/>
               </w:rPr>
-              <w:t>«</w:t>
-            </w:r>
-            <w:proofErr w:type="spellStart"/>
-            <w:r>
-              <w:rPr>
-                <w:color w:val="auto"/>
-              </w:rPr>
-              <w:t>include</w:t>
-            </w:r>
-            <w:proofErr w:type="spellEnd"/>
-            <w:r>
-              <w:rPr>
-                <w:color w:val="auto"/>
-              </w:rPr>
-              <w:t>»</w:t>
+              <w:t>«include»</w:t>
             </w:r>
           </w:p>
         </w:tc>
@@ -24163,21 +23817,7 @@
               <w:rPr>
                 <w:color w:val="auto"/>
               </w:rPr>
-              <w:t>«</w:t>
-            </w:r>
-            <w:proofErr w:type="spellStart"/>
-            <w:r>
-              <w:rPr>
-                <w:color w:val="auto"/>
-              </w:rPr>
-              <w:t>include</w:t>
-            </w:r>
-            <w:proofErr w:type="spellEnd"/>
-            <w:r>
-              <w:rPr>
-                <w:color w:val="auto"/>
-              </w:rPr>
-              <w:t>»</w:t>
+              <w:t>«include»</w:t>
             </w:r>
           </w:p>
         </w:tc>
@@ -24257,21 +23897,7 @@
               <w:rPr>
                 <w:color w:val="auto"/>
               </w:rPr>
-              <w:t>«</w:t>
-            </w:r>
-            <w:proofErr w:type="spellStart"/>
-            <w:r>
-              <w:rPr>
-                <w:color w:val="auto"/>
-              </w:rPr>
-              <w:t>include</w:t>
-            </w:r>
-            <w:proofErr w:type="spellEnd"/>
-            <w:r>
-              <w:rPr>
-                <w:color w:val="auto"/>
-              </w:rPr>
-              <w:t>»</w:t>
+              <w:t>«include»</w:t>
             </w:r>
           </w:p>
         </w:tc>
@@ -24348,21 +23974,7 @@
               <w:rPr>
                 <w:color w:val="auto"/>
               </w:rPr>
-              <w:t>«</w:t>
-            </w:r>
-            <w:proofErr w:type="spellStart"/>
-            <w:r>
-              <w:rPr>
-                <w:color w:val="auto"/>
-              </w:rPr>
-              <w:t>include</w:t>
-            </w:r>
-            <w:proofErr w:type="spellEnd"/>
-            <w:r>
-              <w:rPr>
-                <w:color w:val="auto"/>
-              </w:rPr>
-              <w:t>»</w:t>
+              <w:t>«include»</w:t>
             </w:r>
           </w:p>
         </w:tc>
@@ -24417,7 +24029,6 @@
               <w:rPr>
                 <w:color w:val="auto"/>
               </w:rPr>
-              <w:lastRenderedPageBreak/>
               <w:t>Realizar conversión de unidades</w:t>
             </w:r>
           </w:p>
@@ -24443,21 +24054,7 @@
               <w:rPr>
                 <w:color w:val="auto"/>
               </w:rPr>
-              <w:t>«</w:t>
-            </w:r>
-            <w:proofErr w:type="spellStart"/>
-            <w:r>
-              <w:rPr>
-                <w:color w:val="auto"/>
-              </w:rPr>
-              <w:t>include</w:t>
-            </w:r>
-            <w:proofErr w:type="spellEnd"/>
-            <w:r>
-              <w:rPr>
-                <w:color w:val="auto"/>
-              </w:rPr>
-              <w:t>»</w:t>
+              <w:t>«include»</w:t>
             </w:r>
           </w:p>
         </w:tc>
@@ -24534,21 +24131,7 @@
               <w:rPr>
                 <w:color w:val="auto"/>
               </w:rPr>
-              <w:t>«</w:t>
-            </w:r>
-            <w:proofErr w:type="spellStart"/>
-            <w:r>
-              <w:rPr>
-                <w:color w:val="auto"/>
-              </w:rPr>
-              <w:t>include</w:t>
-            </w:r>
-            <w:proofErr w:type="spellEnd"/>
-            <w:r>
-              <w:rPr>
-                <w:color w:val="auto"/>
-              </w:rPr>
-              <w:t>»</w:t>
+              <w:t>«include»</w:t>
             </w:r>
           </w:p>
         </w:tc>
@@ -24628,21 +24211,7 @@
               <w:rPr>
                 <w:color w:val="auto"/>
               </w:rPr>
-              <w:t>«</w:t>
-            </w:r>
-            <w:proofErr w:type="spellStart"/>
-            <w:r>
-              <w:rPr>
-                <w:color w:val="auto"/>
-              </w:rPr>
-              <w:t>include</w:t>
-            </w:r>
-            <w:proofErr w:type="spellEnd"/>
-            <w:r>
-              <w:rPr>
-                <w:color w:val="auto"/>
-              </w:rPr>
-              <w:t>»</w:t>
+              <w:t>«include»</w:t>
             </w:r>
           </w:p>
         </w:tc>
@@ -24956,21 +24525,7 @@
               <w:rPr>
                 <w:color w:val="auto"/>
               </w:rPr>
-              <w:t>«</w:t>
-            </w:r>
-            <w:proofErr w:type="spellStart"/>
-            <w:r>
-              <w:rPr>
-                <w:color w:val="auto"/>
-              </w:rPr>
-              <w:t>extend</w:t>
-            </w:r>
-            <w:proofErr w:type="spellEnd"/>
-            <w:r>
-              <w:rPr>
-                <w:color w:val="auto"/>
-              </w:rPr>
-              <w:t>» → CU-01</w:t>
+              <w:t>«extend» → CU-01</w:t>
             </w:r>
           </w:p>
         </w:tc>
@@ -25041,21 +24596,7 @@
               <w:rPr>
                 <w:color w:val="auto"/>
               </w:rPr>
-              <w:t>«</w:t>
-            </w:r>
-            <w:proofErr w:type="spellStart"/>
-            <w:r>
-              <w:rPr>
-                <w:color w:val="auto"/>
-              </w:rPr>
-              <w:t>extend</w:t>
-            </w:r>
-            <w:proofErr w:type="spellEnd"/>
-            <w:r>
-              <w:rPr>
-                <w:color w:val="auto"/>
-              </w:rPr>
-              <w:t>» → CU-07</w:t>
+              <w:t>«extend» → CU-07</w:t>
             </w:r>
           </w:p>
         </w:tc>
@@ -25089,7 +24630,7 @@
         <w:keepNext/>
         <w:spacing w:before="240"/>
       </w:pPr>
-      <w:bookmarkStart w:id="95" w:name="_Toc243263209"/>
+      <w:bookmarkStart w:id="95" w:name="_Toc243458951"/>
       <w:r>
         <w:t xml:space="preserve">Tabla </w:t>
       </w:r>
@@ -25528,21 +25069,7 @@
               <w:rPr>
                 <w:color w:val="auto"/>
               </w:rPr>
-              <w:t>Trazabilidad: RQF-015 ↔ CU-17 Gestionar sesión expirada; «</w:t>
-            </w:r>
-            <w:proofErr w:type="spellStart"/>
-            <w:r>
-              <w:rPr>
-                <w:color w:val="auto"/>
-              </w:rPr>
-              <w:t>extend</w:t>
-            </w:r>
-            <w:proofErr w:type="spellEnd"/>
-            <w:r>
-              <w:rPr>
-                <w:color w:val="auto"/>
-              </w:rPr>
-              <w:t>» hacia CU-07 Realizar conversión de unidades, condicionado a token efectivamente expirado. Token ausente/desconocido se trata como AUTH-002.</w:t>
+              <w:t>Trazabilidad: RQF-015 ↔ CU-17 Gestionar sesión expirada; «extend» hacia CU-07 Realizar conversión de unidades, condicionado a token efectivamente expirado. Token ausente/desconocido se trata como AUTH-002.</w:t>
             </w:r>
           </w:p>
         </w:tc>
@@ -25554,9 +25081,8 @@
         <w:keepNext/>
         <w:spacing w:before="240"/>
       </w:pPr>
-      <w:bookmarkStart w:id="96" w:name="_Toc243263210"/>
+      <w:bookmarkStart w:id="96" w:name="_Toc243458952"/>
       <w:r>
-        <w:lastRenderedPageBreak/>
         <w:t xml:space="preserve">Tabla </w:t>
       </w:r>
       <w:fldSimple w:instr=" SEQ Tabla \* ARABIC ">
@@ -26006,7 +25532,7 @@
         <w:keepNext/>
         <w:spacing w:before="240"/>
       </w:pPr>
-      <w:bookmarkStart w:id="97" w:name="_Toc243263211"/>
+      <w:bookmarkStart w:id="97" w:name="_Toc243458953"/>
       <w:r>
         <w:t xml:space="preserve">Tabla </w:t>
       </w:r>
@@ -26457,7 +25983,7 @@
         <w:spacing w:before="240"/>
       </w:pPr>
       <w:bookmarkStart w:id="98" w:name="_kmr7s7su5fdq" w:colFirst="0" w:colLast="0"/>
-      <w:bookmarkStart w:id="99" w:name="_Toc243263166"/>
+      <w:bookmarkStart w:id="99" w:name="_Toc243458908"/>
       <w:bookmarkEnd w:id="98"/>
       <w:r>
         <w:t xml:space="preserve">8.3. </w:t>
@@ -26472,7 +25998,7 @@
         <w:pStyle w:val="Ttulo3"/>
       </w:pPr>
       <w:bookmarkStart w:id="100" w:name="_utkmljsgb9dv" w:colFirst="0" w:colLast="0"/>
-      <w:bookmarkStart w:id="101" w:name="_Toc243263167"/>
+      <w:bookmarkStart w:id="101" w:name="_Toc243458909"/>
       <w:bookmarkEnd w:id="100"/>
       <w:r>
         <w:t xml:space="preserve">8.3.1. </w:t>
@@ -26484,15 +26010,7 @@
     </w:p>
     <w:p>
       <w:r>
-        <w:t xml:space="preserve">Los requisitos no funcionales se aplican al sistema de conversión, a sus </w:t>
-      </w:r>
-      <w:proofErr w:type="spellStart"/>
-      <w:r>
-        <w:t>endpoints</w:t>
-      </w:r>
-      <w:proofErr w:type="spellEnd"/>
-      <w:r>
-        <w:t xml:space="preserve"> SOAP/JAX-WS y a los cuatro clientes. El sistema no necesita funciones de administración comercial, inventarios ni base de datos.</w:t>
+        <w:t>Los requisitos no funcionales se aplican al sistema de conversión, a sus endpoints SOAP/JAX-WS y a los cuatro clientes. El sistema no necesita funciones de administración comercial, inventarios ni base de datos.</w:t>
       </w:r>
     </w:p>
     <w:p>
@@ -26500,7 +26018,7 @@
         <w:pStyle w:val="Descripcin"/>
         <w:keepNext/>
       </w:pPr>
-      <w:bookmarkStart w:id="102" w:name="_Toc243263212"/>
+      <w:bookmarkStart w:id="102" w:name="_Toc243458954"/>
       <w:r>
         <w:t xml:space="preserve">Tabla </w:t>
       </w:r>
@@ -26870,9 +26388,8 @@
         <w:keepNext/>
         <w:spacing w:before="240"/>
       </w:pPr>
-      <w:bookmarkStart w:id="104" w:name="_Toc243263213"/>
+      <w:bookmarkStart w:id="104" w:name="_Toc243458955"/>
       <w:r>
-        <w:lastRenderedPageBreak/>
         <w:t xml:space="preserve">Tabla </w:t>
       </w:r>
       <w:fldSimple w:instr=" SEQ Tabla \* ARABIC ">
@@ -27075,35 +26592,7 @@
               <w:rPr>
                 <w:color w:val="auto"/>
               </w:rPr>
-              <w:t xml:space="preserve">El </w:t>
-            </w:r>
-            <w:proofErr w:type="spellStart"/>
-            <w:r>
-              <w:rPr>
-                <w:color w:val="auto"/>
-              </w:rPr>
-              <w:t>backend</w:t>
-            </w:r>
-            <w:proofErr w:type="spellEnd"/>
-            <w:r>
-              <w:rPr>
-                <w:color w:val="auto"/>
-              </w:rPr>
-              <w:t xml:space="preserve"> se desarrollará en Java mediante servicios SOAP/JAX-WS compatibles con el servidor de aplicaciones elegido; la lógica de conversión estará separada de las clases que exponen los </w:t>
-            </w:r>
-            <w:proofErr w:type="spellStart"/>
-            <w:r>
-              <w:rPr>
-                <w:color w:val="auto"/>
-              </w:rPr>
-              <w:t>endpoints</w:t>
-            </w:r>
-            <w:proofErr w:type="spellEnd"/>
-            <w:r>
-              <w:rPr>
-                <w:color w:val="auto"/>
-              </w:rPr>
-              <w:t>.</w:t>
+              <w:t>El backend se desarrollará en Java mediante servicios SOAP/JAX-WS compatibles con el servidor de aplicaciones elegido; la lógica de conversión estará separada de las clases que exponen los endpoints.</w:t>
             </w:r>
           </w:p>
         </w:tc>
@@ -27264,7 +26753,7 @@
         <w:keepNext/>
         <w:spacing w:before="240"/>
       </w:pPr>
-      <w:bookmarkStart w:id="105" w:name="_Toc243263214"/>
+      <w:bookmarkStart w:id="105" w:name="_Toc243458956"/>
       <w:r>
         <w:t xml:space="preserve">Tabla </w:t>
       </w:r>
@@ -27628,7 +27117,7 @@
         <w:spacing w:before="240"/>
       </w:pPr>
       <w:bookmarkStart w:id="106" w:name="_qqj79dytzghp" w:colFirst="0" w:colLast="0"/>
-      <w:bookmarkStart w:id="107" w:name="_Toc243263215"/>
+      <w:bookmarkStart w:id="107" w:name="_Toc243458957"/>
       <w:bookmarkEnd w:id="106"/>
       <w:r>
         <w:t xml:space="preserve">Tabla </w:t>
@@ -27994,7 +27483,7 @@
         <w:spacing w:before="240"/>
       </w:pPr>
       <w:bookmarkStart w:id="108" w:name="_h2v7cd61blly" w:colFirst="0" w:colLast="0"/>
-      <w:bookmarkStart w:id="109" w:name="_Toc243263216"/>
+      <w:bookmarkStart w:id="109" w:name="_Toc243458958"/>
       <w:bookmarkEnd w:id="108"/>
       <w:r>
         <w:t xml:space="preserve">Tabla </w:t>
@@ -28359,9 +27848,8 @@
         <w:keepNext/>
         <w:spacing w:before="240"/>
       </w:pPr>
-      <w:bookmarkStart w:id="110" w:name="_Toc243263217"/>
+      <w:bookmarkStart w:id="110" w:name="_Toc243458959"/>
       <w:r>
-        <w:lastRenderedPageBreak/>
         <w:t xml:space="preserve">Tabla </w:t>
       </w:r>
       <w:fldSimple w:instr=" SEQ Tabla \* ARABIC ">
@@ -28694,7 +28182,7 @@
         <w:spacing w:before="240"/>
       </w:pPr>
       <w:bookmarkStart w:id="111" w:name="_8ccljsk8nitt" w:colFirst="0" w:colLast="0"/>
-      <w:bookmarkStart w:id="112" w:name="_Toc243263218"/>
+      <w:bookmarkStart w:id="112" w:name="_Toc243458960"/>
       <w:bookmarkEnd w:id="111"/>
       <w:r>
         <w:t xml:space="preserve">Tabla </w:t>
@@ -29172,7 +28660,7 @@
         <w:pStyle w:val="Ttulo2"/>
       </w:pPr>
       <w:bookmarkStart w:id="113" w:name="_oya6lbqlzr94" w:colFirst="0" w:colLast="0"/>
-      <w:bookmarkStart w:id="114" w:name="_Toc243263168"/>
+      <w:bookmarkStart w:id="114" w:name="_Toc243458910"/>
       <w:bookmarkEnd w:id="113"/>
       <w:r>
         <w:t xml:space="preserve">8.4. </w:t>
@@ -29187,7 +28675,7 @@
         <w:pStyle w:val="Ttulo3"/>
       </w:pPr>
       <w:bookmarkStart w:id="115" w:name="_3f0tdsa3sr1f" w:colFirst="0" w:colLast="0"/>
-      <w:bookmarkStart w:id="116" w:name="_Toc243263169"/>
+      <w:bookmarkStart w:id="116" w:name="_Toc243458911"/>
       <w:bookmarkEnd w:id="115"/>
       <w:r>
         <w:t xml:space="preserve">8.4.1. </w:t>
@@ -29253,7 +28741,7 @@
         <w:pStyle w:val="Ttulo3"/>
       </w:pPr>
       <w:bookmarkStart w:id="118" w:name="_bm2n311iy27g" w:colFirst="0" w:colLast="0"/>
-      <w:bookmarkStart w:id="119" w:name="_Toc243263170"/>
+      <w:bookmarkStart w:id="119" w:name="_Toc243458912"/>
       <w:bookmarkEnd w:id="118"/>
       <w:r>
         <w:t xml:space="preserve">8.4.2. </w:t>
@@ -29304,15 +28792,7 @@
         </w:pBdr>
       </w:pPr>
       <w:r>
-        <w:t xml:space="preserve">Dispositivos cliente con memoria y recursos adecuados al </w:t>
-      </w:r>
-      <w:proofErr w:type="spellStart"/>
-      <w:r>
-        <w:t>runtime</w:t>
-      </w:r>
-      <w:proofErr w:type="spellEnd"/>
-      <w:r>
-        <w:t xml:space="preserve"> de su canal.</w:t>
+        <w:t>Dispositivos cliente con memoria y recursos adecuados al runtime de su canal.</w:t>
       </w:r>
     </w:p>
     <w:p>
@@ -29330,7 +28810,6 @@
         </w:pBdr>
       </w:pPr>
       <w:r>
-        <w:lastRenderedPageBreak/>
         <w:t>Conectividad de red entre clientes y servicio de conversiones.</w:t>
       </w:r>
     </w:p>
@@ -29357,7 +28836,7 @@
         <w:pStyle w:val="Ttulo3"/>
       </w:pPr>
       <w:bookmarkStart w:id="120" w:name="_nwhnak779pt5" w:colFirst="0" w:colLast="0"/>
-      <w:bookmarkStart w:id="121" w:name="_Toc243263171"/>
+      <w:bookmarkStart w:id="121" w:name="_Toc243458913"/>
       <w:bookmarkEnd w:id="120"/>
       <w:r>
         <w:t xml:space="preserve">8.4.3. </w:t>
@@ -29399,7 +28878,7 @@
         <w:pStyle w:val="Ttulo1"/>
       </w:pPr>
       <w:bookmarkStart w:id="122" w:name="_cbauyj19pfly" w:colFirst="0" w:colLast="0"/>
-      <w:bookmarkStart w:id="123" w:name="_Toc243263172"/>
+      <w:bookmarkStart w:id="123" w:name="_Toc243458914"/>
       <w:bookmarkEnd w:id="122"/>
       <w:r>
         <w:t xml:space="preserve">9. </w:t>
@@ -29414,7 +28893,7 @@
         <w:pStyle w:val="Ttulo2"/>
       </w:pPr>
       <w:bookmarkStart w:id="124" w:name="_ndcr5u2ncqi1" w:colFirst="0" w:colLast="0"/>
-      <w:bookmarkStart w:id="125" w:name="_Toc243263173"/>
+      <w:bookmarkStart w:id="125" w:name="_Toc243458915"/>
       <w:bookmarkEnd w:id="124"/>
       <w:r>
         <w:t xml:space="preserve">9.1. </w:t>
@@ -29429,7 +28908,7 @@
         <w:pStyle w:val="Ttulo3"/>
       </w:pPr>
       <w:bookmarkStart w:id="126" w:name="_k5tw3di07i4v" w:colFirst="0" w:colLast="0"/>
-      <w:bookmarkStart w:id="127" w:name="_Toc243263174"/>
+      <w:bookmarkStart w:id="127" w:name="_Toc243458916"/>
       <w:bookmarkEnd w:id="126"/>
       <w:r>
         <w:t xml:space="preserve">9.1.1. </w:t>
@@ -29496,15 +28975,7 @@
         </w:rPr>
       </w:pPr>
       <w:r>
-        <w:t>Selectores para categorías y unidades de origen/</w:t>
-      </w:r>
-      <w:proofErr w:type="gramStart"/>
-      <w:r>
-        <w:t>destino disponibles</w:t>
-      </w:r>
-      <w:proofErr w:type="gramEnd"/>
-      <w:r>
-        <w:t>.</w:t>
+        <w:t>Selectores para categorías y unidades de origen/destino disponibles.</w:t>
       </w:r>
     </w:p>
     <w:p>
@@ -29627,7 +29098,7 @@
         <w:pStyle w:val="Ttulo3"/>
       </w:pPr>
       <w:bookmarkStart w:id="128" w:name="_93fnea5yti1i" w:colFirst="0" w:colLast="0"/>
-      <w:bookmarkStart w:id="129" w:name="_Toc243263175"/>
+      <w:bookmarkStart w:id="129" w:name="_Toc243458917"/>
       <w:bookmarkEnd w:id="128"/>
       <w:r>
         <w:t xml:space="preserve">9.1.2. </w:t>
@@ -29652,7 +29123,7 @@
         <w:pStyle w:val="Ttulo3"/>
       </w:pPr>
       <w:bookmarkStart w:id="130" w:name="_33a4sru3zuor" w:colFirst="0" w:colLast="0"/>
-      <w:bookmarkStart w:id="131" w:name="_Toc243263176"/>
+      <w:bookmarkStart w:id="131" w:name="_Toc243458918"/>
       <w:bookmarkEnd w:id="130"/>
       <w:r>
         <w:t xml:space="preserve">9.1.3. </w:t>
@@ -29703,7 +29174,7 @@
         <w:pStyle w:val="Ttulo3"/>
       </w:pPr>
       <w:bookmarkStart w:id="132" w:name="_fr2alkukm7xb" w:colFirst="0" w:colLast="0"/>
-      <w:bookmarkStart w:id="133" w:name="_Toc243263177"/>
+      <w:bookmarkStart w:id="133" w:name="_Toc243458919"/>
       <w:bookmarkEnd w:id="132"/>
       <w:r>
         <w:t xml:space="preserve">9.1.4. </w:t>
@@ -29722,7 +29193,7 @@
       <w:pPr>
         <w:pStyle w:val="Ttulo3"/>
       </w:pPr>
-      <w:bookmarkStart w:id="134" w:name="_Toc243263178"/>
+      <w:bookmarkStart w:id="134" w:name="_Toc243458920"/>
       <w:r>
         <w:t xml:space="preserve">9.1.5. </w:t>
       </w:r>
@@ -29733,11 +29204,7 @@
     </w:p>
     <w:p>
       <w:r>
-        <w:t xml:space="preserve">No se usa base de datos. Las credenciales del usuario y el catálogo se cargan desde memoria o desde archivos de configuración, y la validez de los tokens se controla en memoria mientras el servidor está en </w:t>
-      </w:r>
-      <w:r>
-        <w:lastRenderedPageBreak/>
-        <w:t>ejecución.</w:t>
+        <w:t>No se usa base de datos. Las credenciales del usuario y el catálogo se cargan desde memoria o desde archivos de configuración, y la validez de los tokens se controla en memoria mientras el servidor está en ejecución.</w:t>
       </w:r>
     </w:p>
     <w:p/>
@@ -29746,7 +29213,7 @@
         <w:pStyle w:val="Ttulo1"/>
       </w:pPr>
       <w:bookmarkStart w:id="135" w:name="_ew5ann6w76i5" w:colFirst="0" w:colLast="0"/>
-      <w:bookmarkStart w:id="136" w:name="_Toc243263179"/>
+      <w:bookmarkStart w:id="136" w:name="_Toc243458921"/>
       <w:bookmarkEnd w:id="135"/>
       <w:r>
         <w:t>RECOMENDACIONES</w:t>
@@ -29794,7 +29261,7 @@
         <w:pStyle w:val="Ttulo1"/>
       </w:pPr>
       <w:bookmarkStart w:id="137" w:name="_sq3iqs80vuam" w:colFirst="0" w:colLast="0"/>
-      <w:bookmarkStart w:id="138" w:name="_Toc243263180"/>
+      <w:bookmarkStart w:id="138" w:name="_Toc243458922"/>
       <w:bookmarkEnd w:id="137"/>
       <w:r>
         <w:t>CONCLUSIONES</w:t>
@@ -29859,7 +29326,7 @@
       <w:pPr>
         <w:pStyle w:val="Ttulo1"/>
       </w:pPr>
-      <w:bookmarkStart w:id="139" w:name="_Toc243263181"/>
+      <w:bookmarkStart w:id="139" w:name="_Toc243458923"/>
       <w:r>
         <w:t>BIBLIOGRAFÍA</w:t>
       </w:r>
@@ -29895,15 +29362,7 @@
         <w:t xml:space="preserve">Diagrama de casos de uso «Sistema Conversión de Unidades», </w:t>
       </w:r>
       <w:r>
-        <w:t xml:space="preserve">elaborado en </w:t>
-      </w:r>
-      <w:proofErr w:type="spellStart"/>
-      <w:r>
-        <w:t>PowerDesigner</w:t>
-      </w:r>
-      <w:proofErr w:type="spellEnd"/>
-      <w:r>
-        <w:t xml:space="preserve"> y usado como base para el ERS.</w:t>
+        <w:t>elaborado en PowerDesigner y usado como base para el ERS.</w:t>
       </w:r>
     </w:p>
     <w:sectPr>
@@ -29947,16 +29406,6 @@
 </file>
 
 <file path=word/footer1.xml><?xml version="1.0" encoding="utf-8"?>
-<w:ftr xmlns:wpc="http://schemas.microsoft.com/office/word/2010/wordprocessingCanvas" xmlns:cx="http://schemas.microsoft.com/office/drawing/2014/chartex" xmlns:cx1="http://schemas.microsoft.com/office/drawing/2015/9/8/chartex" xmlns:cx2="http://schemas.microsoft.com/office/drawing/2015/10/21/chartex" xmlns:cx3="http://schemas.microsoft.com/office/drawing/2016/5/9/chartex" xmlns:cx4="http://schemas.microsoft.com/office/drawing/2016/5/10/chartex" xmlns:cx5="http://schemas.microsoft.com/office/drawing/2016/5/11/chartex" xmlns:cx6="http://schemas.microsoft.com/office/drawing/2016/5/12/chartex" xmlns:cx7="http://schemas.microsoft.com/office/drawing/2016/5/13/chartex" xmlns:cx8="http://schemas.microsoft.com/office/drawing/2016/5/14/chartex" xmlns:mc="http://schemas.openxmlformats.org/markup-compatibility/2006" xmlns:aink="http://schemas.microsoft.com/office/drawing/2016/ink" xmlns:am3d="http://schemas.microsoft.com/office/drawing/2017/model3d" xmlns:o="urn:schemas-microsoft-com:office:office" xmlns:oel="http://schemas.microsoft.com/office/2019/extlst" xmlns:r="http://schemas.openxmlformats.org/officeDocument/2006/relationships" xmlns:m="http://schemas.openxmlformats.org/officeDocument/2006/math" xmlns:v="urn:schemas-microsoft-com:vml" xmlns:wp14="http://schemas.microsoft.com/office/word/2010/wordprocessingDrawing" xmlns:wp="http://schemas.openxmlformats.org/drawingml/2006/wordprocessingDrawing" xmlns:w10="urn:schemas-microsoft-com:office:word" xmlns:w="http://schemas.openxmlformats.org/wordprocessingml/2006/main" xmlns:w14="http://schemas.microsoft.com/office/word/2010/wordml" xmlns:w15="http://schemas.microsoft.com/office/word/2012/wordml" xmlns:w16cex="http://schemas.microsoft.com/office/word/2018/wordml/cex" xmlns:w16cid="http://schemas.microsoft.com/office/word/2016/wordml/cid" xmlns:w16="http://schemas.microsoft.com/office/word/2018/wordml" xmlns:w16du="http://schemas.microsoft.com/office/word/2023/wordml/word16du" xmlns:w16sdtdh="http://schemas.microsoft.com/office/word/2020/wordml/sdtdatahash" xmlns:w16sdtfl="http://schemas.microsoft.com/office/word/2024/wordml/sdtformatlock" xmlns:w16se="http://schemas.microsoft.com/office/word/2015/wordml/symex" xmlns:wpg="http://schemas.microsoft.com/office/word/2010/wordprocessingGroup" xmlns:wpi="http://schemas.microsoft.com/office/word/2010/wordprocessingInk" xmlns:wne="http://schemas.microsoft.com/office/word/2006/wordml" xmlns:wps="http://schemas.microsoft.com/office/word/2010/wordprocessingShape" mc:Ignorable="w14 w15 w16se w16cid w16 w16cex w16sdtdh w16sdtfl w16du wp14">
-  <w:p>
-    <w:pPr>
-      <w:pStyle w:val="Piedepgina"/>
-    </w:pPr>
-  </w:p>
-</w:ftr>
-</file>
-
-<file path=word/footer2.xml><?xml version="1.0" encoding="utf-8"?>
 <w:ftr xmlns:wpc="http://schemas.microsoft.com/office/word/2010/wordprocessingCanvas" xmlns:cx="http://schemas.microsoft.com/office/drawing/2014/chartex" xmlns:cx1="http://schemas.microsoft.com/office/drawing/2015/9/8/chartex" xmlns:cx2="http://schemas.microsoft.com/office/drawing/2015/10/21/chartex" xmlns:cx3="http://schemas.microsoft.com/office/drawing/2016/5/9/chartex" xmlns:cx4="http://schemas.microsoft.com/office/drawing/2016/5/10/chartex" xmlns:cx5="http://schemas.microsoft.com/office/drawing/2016/5/11/chartex" xmlns:cx6="http://schemas.microsoft.com/office/drawing/2016/5/12/chartex" xmlns:cx7="http://schemas.microsoft.com/office/drawing/2016/5/13/chartex" xmlns:cx8="http://schemas.microsoft.com/office/drawing/2016/5/14/chartex" xmlns:mc="http://schemas.openxmlformats.org/markup-compatibility/2006" xmlns:aink="http://schemas.microsoft.com/office/drawing/2016/ink" xmlns:am3d="http://schemas.microsoft.com/office/drawing/2017/model3d" xmlns:o="urn:schemas-microsoft-com:office:office" xmlns:oel="http://schemas.microsoft.com/office/2019/extlst" xmlns:r="http://schemas.openxmlformats.org/officeDocument/2006/relationships" xmlns:m="http://schemas.openxmlformats.org/officeDocument/2006/math" xmlns:v="urn:schemas-microsoft-com:vml" xmlns:wp14="http://schemas.microsoft.com/office/word/2010/wordprocessingDrawing" xmlns:wp="http://schemas.openxmlformats.org/drawingml/2006/wordprocessingDrawing" xmlns:w10="urn:schemas-microsoft-com:office:word" xmlns:w="http://schemas.openxmlformats.org/wordprocessingml/2006/main" xmlns:w14="http://schemas.microsoft.com/office/word/2010/wordml" xmlns:w15="http://schemas.microsoft.com/office/word/2012/wordml" xmlns:w16cex="http://schemas.microsoft.com/office/word/2018/wordml/cex" xmlns:w16cid="http://schemas.microsoft.com/office/word/2016/wordml/cid" xmlns:w16="http://schemas.microsoft.com/office/word/2018/wordml" xmlns:w16du="http://schemas.microsoft.com/office/word/2023/wordml/word16du" xmlns:w16sdtdh="http://schemas.microsoft.com/office/word/2020/wordml/sdtdatahash" xmlns:w16sdtfl="http://schemas.microsoft.com/office/word/2024/wordml/sdtformatlock" xmlns:w16se="http://schemas.microsoft.com/office/word/2015/wordml/symex" xmlns:wpg="http://schemas.microsoft.com/office/word/2010/wordprocessingGroup" xmlns:wpi="http://schemas.microsoft.com/office/word/2010/wordprocessingInk" xmlns:wne="http://schemas.microsoft.com/office/word/2006/wordml" xmlns:wps="http://schemas.microsoft.com/office/word/2010/wordprocessingShape" mc:Ignorable="w14 w15 w16se w16cid w16 w16cex w16sdtdh w16sdtfl w16du wp14">
   <w:p>
     <w:pPr>
@@ -30004,17 +29453,7 @@
 </w:ftr>
 </file>
 
-<file path=word/footer3.xml><?xml version="1.0" encoding="utf-8"?>
-<w:ftr xmlns:wpc="http://schemas.microsoft.com/office/word/2010/wordprocessingCanvas" xmlns:cx="http://schemas.microsoft.com/office/drawing/2014/chartex" xmlns:cx1="http://schemas.microsoft.com/office/drawing/2015/9/8/chartex" xmlns:cx2="http://schemas.microsoft.com/office/drawing/2015/10/21/chartex" xmlns:cx3="http://schemas.microsoft.com/office/drawing/2016/5/9/chartex" xmlns:cx4="http://schemas.microsoft.com/office/drawing/2016/5/10/chartex" xmlns:cx5="http://schemas.microsoft.com/office/drawing/2016/5/11/chartex" xmlns:cx6="http://schemas.microsoft.com/office/drawing/2016/5/12/chartex" xmlns:cx7="http://schemas.microsoft.com/office/drawing/2016/5/13/chartex" xmlns:cx8="http://schemas.microsoft.com/office/drawing/2016/5/14/chartex" xmlns:mc="http://schemas.openxmlformats.org/markup-compatibility/2006" xmlns:aink="http://schemas.microsoft.com/office/drawing/2016/ink" xmlns:am3d="http://schemas.microsoft.com/office/drawing/2017/model3d" xmlns:o="urn:schemas-microsoft-com:office:office" xmlns:oel="http://schemas.microsoft.com/office/2019/extlst" xmlns:r="http://schemas.openxmlformats.org/officeDocument/2006/relationships" xmlns:m="http://schemas.openxmlformats.org/officeDocument/2006/math" xmlns:v="urn:schemas-microsoft-com:vml" xmlns:wp14="http://schemas.microsoft.com/office/word/2010/wordprocessingDrawing" xmlns:wp="http://schemas.openxmlformats.org/drawingml/2006/wordprocessingDrawing" xmlns:w10="urn:schemas-microsoft-com:office:word" xmlns:w="http://schemas.openxmlformats.org/wordprocessingml/2006/main" xmlns:w14="http://schemas.microsoft.com/office/word/2010/wordml" xmlns:w15="http://schemas.microsoft.com/office/word/2012/wordml" xmlns:w16cex="http://schemas.microsoft.com/office/word/2018/wordml/cex" xmlns:w16cid="http://schemas.microsoft.com/office/word/2016/wordml/cid" xmlns:w16="http://schemas.microsoft.com/office/word/2018/wordml" xmlns:w16du="http://schemas.microsoft.com/office/word/2023/wordml/word16du" xmlns:w16sdtdh="http://schemas.microsoft.com/office/word/2020/wordml/sdtdatahash" xmlns:w16sdtfl="http://schemas.microsoft.com/office/word/2024/wordml/sdtformatlock" xmlns:w16se="http://schemas.microsoft.com/office/word/2015/wordml/symex" xmlns:wpg="http://schemas.microsoft.com/office/word/2010/wordprocessingGroup" xmlns:wpi="http://schemas.microsoft.com/office/word/2010/wordprocessingInk" xmlns:wne="http://schemas.microsoft.com/office/word/2006/wordml" xmlns:wps="http://schemas.microsoft.com/office/word/2010/wordprocessingShape" mc:Ignorable="w14 w15 w16se w16cid w16 w16cex w16sdtdh w16sdtfl w16du wp14">
-  <w:p>
-    <w:pPr>
-      <w:pStyle w:val="Piedepgina"/>
-    </w:pPr>
-  </w:p>
-</w:ftr>
-</file>
-
-<file path=word/footer4.xml><?xml version="1.0" encoding="utf-8"?>
+<file path=word/footer2.xml><?xml version="1.0" encoding="utf-8"?>
 <w:ftr xmlns:wpc="http://schemas.microsoft.com/office/word/2010/wordprocessingCanvas" xmlns:cx="http://schemas.microsoft.com/office/drawing/2014/chartex" xmlns:cx1="http://schemas.microsoft.com/office/drawing/2015/9/8/chartex" xmlns:cx2="http://schemas.microsoft.com/office/drawing/2015/10/21/chartex" xmlns:cx3="http://schemas.microsoft.com/office/drawing/2016/5/9/chartex" xmlns:cx4="http://schemas.microsoft.com/office/drawing/2016/5/10/chartex" xmlns:cx5="http://schemas.microsoft.com/office/drawing/2016/5/11/chartex" xmlns:cx6="http://schemas.microsoft.com/office/drawing/2016/5/12/chartex" xmlns:cx7="http://schemas.microsoft.com/office/drawing/2016/5/13/chartex" xmlns:cx8="http://schemas.microsoft.com/office/drawing/2016/5/14/chartex" xmlns:mc="http://schemas.openxmlformats.org/markup-compatibility/2006" xmlns:aink="http://schemas.microsoft.com/office/drawing/2016/ink" xmlns:am3d="http://schemas.microsoft.com/office/drawing/2017/model3d" xmlns:o="urn:schemas-microsoft-com:office:office" xmlns:oel="http://schemas.microsoft.com/office/2019/extlst" xmlns:r="http://schemas.openxmlformats.org/officeDocument/2006/relationships" xmlns:m="http://schemas.openxmlformats.org/officeDocument/2006/math" xmlns:v="urn:schemas-microsoft-com:vml" xmlns:wp14="http://schemas.microsoft.com/office/word/2010/wordprocessingDrawing" xmlns:wp="http://schemas.openxmlformats.org/drawingml/2006/wordprocessingDrawing" xmlns:w10="urn:schemas-microsoft-com:office:word" xmlns:w="http://schemas.openxmlformats.org/wordprocessingml/2006/main" xmlns:w14="http://schemas.microsoft.com/office/word/2010/wordml" xmlns:w15="http://schemas.microsoft.com/office/word/2012/wordml" xmlns:w16cex="http://schemas.microsoft.com/office/word/2018/wordml/cex" xmlns:w16cid="http://schemas.microsoft.com/office/word/2016/wordml/cid" xmlns:w16="http://schemas.microsoft.com/office/word/2018/wordml" xmlns:w16du="http://schemas.microsoft.com/office/word/2023/wordml/word16du" xmlns:w16sdtdh="http://schemas.microsoft.com/office/word/2020/wordml/sdtdatahash" xmlns:w16sdtfl="http://schemas.microsoft.com/office/word/2024/wordml/sdtformatlock" xmlns:w16se="http://schemas.microsoft.com/office/word/2015/wordml/symex" xmlns:wpg="http://schemas.microsoft.com/office/word/2010/wordprocessingGroup" xmlns:wpi="http://schemas.microsoft.com/office/word/2010/wordprocessingInk" xmlns:wne="http://schemas.microsoft.com/office/word/2006/wordml" xmlns:wps="http://schemas.microsoft.com/office/word/2010/wordprocessingShape" mc:Ignorable="w14 w15 w16se w16cid w16 w16cex w16sdtdh w16sdtfl w16du wp14">
   <w:p>
     <w:pPr>
@@ -30060,36 +29499,6 @@
 </file>
 
 <file path=word/header1.xml><?xml version="1.0" encoding="utf-8"?>
-<w:hdr xmlns:wpc="http://schemas.microsoft.com/office/word/2010/wordprocessingCanvas" xmlns:cx="http://schemas.microsoft.com/office/drawing/2014/chartex" xmlns:cx1="http://schemas.microsoft.com/office/drawing/2015/9/8/chartex" xmlns:cx2="http://schemas.microsoft.com/office/drawing/2015/10/21/chartex" xmlns:cx3="http://schemas.microsoft.com/office/drawing/2016/5/9/chartex" xmlns:cx4="http://schemas.microsoft.com/office/drawing/2016/5/10/chartex" xmlns:cx5="http://schemas.microsoft.com/office/drawing/2016/5/11/chartex" xmlns:cx6="http://schemas.microsoft.com/office/drawing/2016/5/12/chartex" xmlns:cx7="http://schemas.microsoft.com/office/drawing/2016/5/13/chartex" xmlns:cx8="http://schemas.microsoft.com/office/drawing/2016/5/14/chartex" xmlns:mc="http://schemas.openxmlformats.org/markup-compatibility/2006" xmlns:aink="http://schemas.microsoft.com/office/drawing/2016/ink" xmlns:am3d="http://schemas.microsoft.com/office/drawing/2017/model3d" xmlns:o="urn:schemas-microsoft-com:office:office" xmlns:oel="http://schemas.microsoft.com/office/2019/extlst" xmlns:r="http://schemas.openxmlformats.org/officeDocument/2006/relationships" xmlns:m="http://schemas.openxmlformats.org/officeDocument/2006/math" xmlns:v="urn:schemas-microsoft-com:vml" xmlns:wp14="http://schemas.microsoft.com/office/word/2010/wordprocessingDrawing" xmlns:wp="http://schemas.openxmlformats.org/drawingml/2006/wordprocessingDrawing" xmlns:w10="urn:schemas-microsoft-com:office:word" xmlns:w="http://schemas.openxmlformats.org/wordprocessingml/2006/main" xmlns:w14="http://schemas.microsoft.com/office/word/2010/wordml" xmlns:w15="http://schemas.microsoft.com/office/word/2012/wordml" xmlns:w16cex="http://schemas.microsoft.com/office/word/2018/wordml/cex" xmlns:w16cid="http://schemas.microsoft.com/office/word/2016/wordml/cid" xmlns:w16="http://schemas.microsoft.com/office/word/2018/wordml" xmlns:w16du="http://schemas.microsoft.com/office/word/2023/wordml/word16du" xmlns:w16sdtdh="http://schemas.microsoft.com/office/word/2020/wordml/sdtdatahash" xmlns:w16sdtfl="http://schemas.microsoft.com/office/word/2024/wordml/sdtformatlock" xmlns:w16se="http://schemas.microsoft.com/office/word/2015/wordml/symex" xmlns:wpg="http://schemas.microsoft.com/office/word/2010/wordprocessingGroup" xmlns:wpi="http://schemas.microsoft.com/office/word/2010/wordprocessingInk" xmlns:wne="http://schemas.microsoft.com/office/word/2006/wordml" xmlns:wps="http://schemas.microsoft.com/office/word/2010/wordprocessingShape" mc:Ignorable="w14 w15 w16se w16cid w16 w16cex w16sdtdh w16sdtfl w16du wp14">
-  <w:p>
-    <w:pPr>
-      <w:pStyle w:val="Encabezado"/>
-    </w:pPr>
-  </w:p>
-</w:hdr>
-</file>
-
-<file path=word/header2.xml><?xml version="1.0" encoding="utf-8"?>
-<w:hdr xmlns:wpc="http://schemas.microsoft.com/office/word/2010/wordprocessingCanvas" xmlns:cx="http://schemas.microsoft.com/office/drawing/2014/chartex" xmlns:cx1="http://schemas.microsoft.com/office/drawing/2015/9/8/chartex" xmlns:cx2="http://schemas.microsoft.com/office/drawing/2015/10/21/chartex" xmlns:cx3="http://schemas.microsoft.com/office/drawing/2016/5/9/chartex" xmlns:cx4="http://schemas.microsoft.com/office/drawing/2016/5/10/chartex" xmlns:cx5="http://schemas.microsoft.com/office/drawing/2016/5/11/chartex" xmlns:cx6="http://schemas.microsoft.com/office/drawing/2016/5/12/chartex" xmlns:cx7="http://schemas.microsoft.com/office/drawing/2016/5/13/chartex" xmlns:cx8="http://schemas.microsoft.com/office/drawing/2016/5/14/chartex" xmlns:mc="http://schemas.openxmlformats.org/markup-compatibility/2006" xmlns:aink="http://schemas.microsoft.com/office/drawing/2016/ink" xmlns:am3d="http://schemas.microsoft.com/office/drawing/2017/model3d" xmlns:o="urn:schemas-microsoft-com:office:office" xmlns:oel="http://schemas.microsoft.com/office/2019/extlst" xmlns:r="http://schemas.openxmlformats.org/officeDocument/2006/relationships" xmlns:m="http://schemas.openxmlformats.org/officeDocument/2006/math" xmlns:v="urn:schemas-microsoft-com:vml" xmlns:wp14="http://schemas.microsoft.com/office/word/2010/wordprocessingDrawing" xmlns:wp="http://schemas.openxmlformats.org/drawingml/2006/wordprocessingDrawing" xmlns:w10="urn:schemas-microsoft-com:office:word" xmlns:w="http://schemas.openxmlformats.org/wordprocessingml/2006/main" xmlns:w14="http://schemas.microsoft.com/office/word/2010/wordml" xmlns:w15="http://schemas.microsoft.com/office/word/2012/wordml" xmlns:w16cex="http://schemas.microsoft.com/office/word/2018/wordml/cex" xmlns:w16cid="http://schemas.microsoft.com/office/word/2016/wordml/cid" xmlns:w16="http://schemas.microsoft.com/office/word/2018/wordml" xmlns:w16du="http://schemas.microsoft.com/office/word/2023/wordml/word16du" xmlns:w16sdtdh="http://schemas.microsoft.com/office/word/2020/wordml/sdtdatahash" xmlns:w16sdtfl="http://schemas.microsoft.com/office/word/2024/wordml/sdtformatlock" xmlns:w16se="http://schemas.microsoft.com/office/word/2015/wordml/symex" xmlns:wpg="http://schemas.microsoft.com/office/word/2010/wordprocessingGroup" xmlns:wpi="http://schemas.microsoft.com/office/word/2010/wordprocessingInk" xmlns:wne="http://schemas.microsoft.com/office/word/2006/wordml" xmlns:wps="http://schemas.microsoft.com/office/word/2010/wordprocessingShape" mc:Ignorable="w14 w15 w16se w16cid w16 w16cex w16sdtdh w16sdtfl w16du wp14">
-  <w:p>
-    <w:pPr>
-      <w:pStyle w:val="Encabezado"/>
-    </w:pPr>
-  </w:p>
-</w:hdr>
-</file>
-
-<file path=word/header3.xml><?xml version="1.0" encoding="utf-8"?>
-<w:hdr xmlns:wpc="http://schemas.microsoft.com/office/word/2010/wordprocessingCanvas" xmlns:cx="http://schemas.microsoft.com/office/drawing/2014/chartex" xmlns:cx1="http://schemas.microsoft.com/office/drawing/2015/9/8/chartex" xmlns:cx2="http://schemas.microsoft.com/office/drawing/2015/10/21/chartex" xmlns:cx3="http://schemas.microsoft.com/office/drawing/2016/5/9/chartex" xmlns:cx4="http://schemas.microsoft.com/office/drawing/2016/5/10/chartex" xmlns:cx5="http://schemas.microsoft.com/office/drawing/2016/5/11/chartex" xmlns:cx6="http://schemas.microsoft.com/office/drawing/2016/5/12/chartex" xmlns:cx7="http://schemas.microsoft.com/office/drawing/2016/5/13/chartex" xmlns:cx8="http://schemas.microsoft.com/office/drawing/2016/5/14/chartex" xmlns:mc="http://schemas.openxmlformats.org/markup-compatibility/2006" xmlns:aink="http://schemas.microsoft.com/office/drawing/2016/ink" xmlns:am3d="http://schemas.microsoft.com/office/drawing/2017/model3d" xmlns:o="urn:schemas-microsoft-com:office:office" xmlns:oel="http://schemas.microsoft.com/office/2019/extlst" xmlns:r="http://schemas.openxmlformats.org/officeDocument/2006/relationships" xmlns:m="http://schemas.openxmlformats.org/officeDocument/2006/math" xmlns:v="urn:schemas-microsoft-com:vml" xmlns:wp14="http://schemas.microsoft.com/office/word/2010/wordprocessingDrawing" xmlns:wp="http://schemas.openxmlformats.org/drawingml/2006/wordprocessingDrawing" xmlns:w10="urn:schemas-microsoft-com:office:word" xmlns:w="http://schemas.openxmlformats.org/wordprocessingml/2006/main" xmlns:w14="http://schemas.microsoft.com/office/word/2010/wordml" xmlns:w15="http://schemas.microsoft.com/office/word/2012/wordml" xmlns:w16cex="http://schemas.microsoft.com/office/word/2018/wordml/cex" xmlns:w16cid="http://schemas.microsoft.com/office/word/2016/wordml/cid" xmlns:w16="http://schemas.microsoft.com/office/word/2018/wordml" xmlns:w16du="http://schemas.microsoft.com/office/word/2023/wordml/word16du" xmlns:w16sdtdh="http://schemas.microsoft.com/office/word/2020/wordml/sdtdatahash" xmlns:w16sdtfl="http://schemas.microsoft.com/office/word/2024/wordml/sdtformatlock" xmlns:w16se="http://schemas.microsoft.com/office/word/2015/wordml/symex" xmlns:wpg="http://schemas.microsoft.com/office/word/2010/wordprocessingGroup" xmlns:wpi="http://schemas.microsoft.com/office/word/2010/wordprocessingInk" xmlns:wne="http://schemas.microsoft.com/office/word/2006/wordml" xmlns:wps="http://schemas.microsoft.com/office/word/2010/wordprocessingShape" mc:Ignorable="w14 w15 w16se w16cid w16 w16cex w16sdtdh w16sdtfl w16du wp14">
-  <w:p>
-    <w:pPr>
-      <w:pStyle w:val="Encabezado"/>
-    </w:pPr>
-  </w:p>
-</w:hdr>
-</file>
-
-<file path=word/header4.xml><?xml version="1.0" encoding="utf-8"?>
 <w:hdr xmlns:wpc="http://schemas.microsoft.com/office/word/2010/wordprocessingCanvas" xmlns:cx="http://schemas.microsoft.com/office/drawing/2014/chartex" xmlns:cx1="http://schemas.microsoft.com/office/drawing/2015/9/8/chartex" xmlns:cx2="http://schemas.microsoft.com/office/drawing/2015/10/21/chartex" xmlns:cx3="http://schemas.microsoft.com/office/drawing/2016/5/9/chartex" xmlns:cx4="http://schemas.microsoft.com/office/drawing/2016/5/10/chartex" xmlns:cx5="http://schemas.microsoft.com/office/drawing/2016/5/11/chartex" xmlns:cx6="http://schemas.microsoft.com/office/drawing/2016/5/12/chartex" xmlns:cx7="http://schemas.microsoft.com/office/drawing/2016/5/13/chartex" xmlns:cx8="http://schemas.microsoft.com/office/drawing/2016/5/14/chartex" xmlns:mc="http://schemas.openxmlformats.org/markup-compatibility/2006" xmlns:aink="http://schemas.microsoft.com/office/drawing/2016/ink" xmlns:am3d="http://schemas.microsoft.com/office/drawing/2017/model3d" xmlns:o="urn:schemas-microsoft-com:office:office" xmlns:oel="http://schemas.microsoft.com/office/2019/extlst" xmlns:r="http://schemas.openxmlformats.org/officeDocument/2006/relationships" xmlns:m="http://schemas.openxmlformats.org/officeDocument/2006/math" xmlns:v="urn:schemas-microsoft-com:vml" xmlns:wp14="http://schemas.microsoft.com/office/word/2010/wordprocessingDrawing" xmlns:wp="http://schemas.openxmlformats.org/drawingml/2006/wordprocessingDrawing" xmlns:w10="urn:schemas-microsoft-com:office:word" xmlns:w="http://schemas.openxmlformats.org/wordprocessingml/2006/main" xmlns:w14="http://schemas.microsoft.com/office/word/2010/wordml" xmlns:w15="http://schemas.microsoft.com/office/word/2012/wordml" xmlns:w16cex="http://schemas.microsoft.com/office/word/2018/wordml/cex" xmlns:w16cid="http://schemas.microsoft.com/office/word/2016/wordml/cid" xmlns:w16="http://schemas.microsoft.com/office/word/2018/wordml" xmlns:w16du="http://schemas.microsoft.com/office/word/2023/wordml/word16du" xmlns:w16sdtdh="http://schemas.microsoft.com/office/word/2020/wordml/sdtdatahash" xmlns:w16sdtfl="http://schemas.microsoft.com/office/word/2024/wordml/sdtformatlock" xmlns:w16se="http://schemas.microsoft.com/office/word/2015/wordml/symex" xmlns:wpg="http://schemas.microsoft.com/office/word/2010/wordprocessingGroup" xmlns:wpi="http://schemas.microsoft.com/office/word/2010/wordprocessingInk" xmlns:wne="http://schemas.microsoft.com/office/word/2006/wordml" xmlns:wps="http://schemas.microsoft.com/office/word/2010/wordprocessingShape" mc:Ignorable="w14 w15 w16se w16cid w16 w16cex w16sdtdh w16sdtfl w16du wp14">
   <w:p>
     <w:pPr>

</xml_diff>